<commit_message>
Régénération de Sami et de la grille
</commit_message>
<xml_diff>
--- a/_source/tp-doc-aide-correction.docx
+++ b/_source/tp-doc-aide-correction.docx
@@ -977,7 +977,7 @@
 
 <file path=word/comments.xml><?xml version="1.0" encoding="utf-8"?>
 <w:comments xmlns:a="http://schemas.openxmlformats.org/drawingml/2006/main" xmlns:pic="http://schemas.openxmlformats.org/drawingml/2006/picture" xmlns:r="http://schemas.openxmlformats.org/officeDocument/2006/relationships" xmlns:w="http://schemas.openxmlformats.org/wordprocessingml/2006/main" xmlns:wp="http://schemas.openxmlformats.org/drawingml/2006/wordprocessingDrawing" xmlns:mc="http://schemas.openxmlformats.org/markup-compatibility/2006" xmlns:a14="http://schemas.microsoft.com/office/drawing/2010/main" xmlns:w14="http://schemas.microsoft.com/office/word/2010/wordml" xmlns:wpc="http://schemas.microsoft.com/office/word/2010/wordprocessingCanvas">
-  <w:comment w:id="0" w:author="Formation IGPDE" w:initials="IGPDE" w:date="2026-09-27T20:57:33Z">
+  <w:comment w:id="0" w:author="Formation IGPDE" w:initials="IGPDE" w:date="2026-09-29T12:54:16Z">
     <w:p>
       <w:pPr>
         <w:pStyle w:val="CommentText"/>
@@ -993,7 +993,7 @@
       </w:r>
     </w:p>
   </w:comment>
-  <w:comment w:id="1" w:author="Formation IGPDE" w:initials="IGPDE" w:date="2026-09-27T20:57:33Z">
+  <w:comment w:id="1" w:author="Formation IGPDE" w:initials="IGPDE" w:date="2026-09-29T12:54:16Z">
     <w:p>
       <w:pPr>
         <w:pStyle w:val="CommentText"/>
@@ -1009,7 +1009,7 @@
       </w:r>
     </w:p>
   </w:comment>
-  <w:comment w:id="2" w:author="Formation IGPDE" w:initials="IGPDE" w:date="2026-09-27T20:57:33Z">
+  <w:comment w:id="2" w:author="Formation IGPDE" w:initials="IGPDE" w:date="2026-09-29T12:54:16Z">
     <w:p>
       <w:pPr>
         <w:pStyle w:val="CommentText"/>
@@ -1025,7 +1025,7 @@
       </w:r>
     </w:p>
   </w:comment>
-  <w:comment w:id="3" w:author="Formation IGPDE" w:initials="IGPDE" w:date="2026-09-27T20:57:33Z">
+  <w:comment w:id="3" w:author="Formation IGPDE" w:initials="IGPDE" w:date="2026-09-29T12:54:16Z">
     <w:p>
       <w:pPr>
         <w:pStyle w:val="CommentText"/>
@@ -1041,7 +1041,7 @@
       </w:r>
     </w:p>
   </w:comment>
-  <w:comment w:id="4" w:author="Formation IGPDE" w:initials="IGPDE" w:date="2026-09-27T20:57:33Z">
+  <w:comment w:id="4" w:author="Formation IGPDE" w:initials="IGPDE" w:date="2026-09-29T12:54:16Z">
     <w:p>
       <w:pPr>
         <w:pStyle w:val="CommentText"/>
@@ -1057,7 +1057,7 @@
       </w:r>
     </w:p>
   </w:comment>
-  <w:comment w:id="5" w:author="Formation IGPDE" w:initials="IGPDE" w:date="2026-09-27T20:57:33Z">
+  <w:comment w:id="5" w:author="Formation IGPDE" w:initials="IGPDE" w:date="2026-09-29T12:54:16Z">
     <w:p>
       <w:pPr>
         <w:pStyle w:val="CommentText"/>
@@ -1073,7 +1073,7 @@
       </w:r>
     </w:p>
   </w:comment>
-  <w:comment w:id="6" w:author="Formation IGPDE" w:initials="IGPDE" w:date="2026-09-27T20:57:33Z">
+  <w:comment w:id="6" w:author="Formation IGPDE" w:initials="IGPDE" w:date="2026-09-29T12:54:16Z">
     <w:p>
       <w:pPr>
         <w:pStyle w:val="CommentText"/>
@@ -1089,7 +1089,7 @@
       </w:r>
     </w:p>
   </w:comment>
-  <w:comment w:id="7" w:author="Formation IGPDE" w:initials="IGPDE" w:date="2026-09-27T20:57:33Z">
+  <w:comment w:id="7" w:author="Formation IGPDE" w:initials="IGPDE" w:date="2026-09-29T12:54:16Z">
     <w:p>
       <w:pPr>
         <w:pStyle w:val="CommentText"/>
@@ -1105,7 +1105,7 @@
       </w:r>
     </w:p>
   </w:comment>
-  <w:comment w:id="8" w:author="Formation IGPDE" w:initials="IGPDE" w:date="2026-09-27T20:57:33Z">
+  <w:comment w:id="8" w:author="Formation IGPDE" w:initials="IGPDE" w:date="2026-09-29T12:54:16Z">
     <w:p>
       <w:pPr>
         <w:pStyle w:val="CommentText"/>
@@ -1121,7 +1121,7 @@
       </w:r>
     </w:p>
   </w:comment>
-  <w:comment w:id="9" w:author="Formation IGPDE" w:initials="IGPDE" w:date="2026-09-27T20:57:33Z">
+  <w:comment w:id="9" w:author="Formation IGPDE" w:initials="IGPDE" w:date="2026-09-29T12:54:16Z">
     <w:p>
       <w:pPr>
         <w:pStyle w:val="CommentText"/>
@@ -1137,7 +1137,7 @@
       </w:r>
     </w:p>
   </w:comment>
-  <w:comment w:id="10" w:author="Formation IGPDE" w:initials="IGPDE" w:date="2026-09-27T20:57:33Z">
+  <w:comment w:id="10" w:author="Formation IGPDE" w:initials="IGPDE" w:date="2026-09-29T12:54:16Z">
     <w:p>
       <w:pPr>
         <w:pStyle w:val="CommentText"/>
@@ -1153,7 +1153,7 @@
       </w:r>
     </w:p>
   </w:comment>
-  <w:comment w:id="11" w:author="Formation IGPDE" w:initials="IGPDE" w:date="2026-09-27T20:57:33Z">
+  <w:comment w:id="11" w:author="Formation IGPDE" w:initials="IGPDE" w:date="2026-09-29T12:54:16Z">
     <w:p>
       <w:pPr>
         <w:pStyle w:val="CommentText"/>
@@ -1169,7 +1169,7 @@
       </w:r>
     </w:p>
   </w:comment>
-  <w:comment w:id="12" w:author="Formation IGPDE" w:initials="IGPDE" w:date="2026-09-27T20:57:33Z">
+  <w:comment w:id="12" w:author="Formation IGPDE" w:initials="IGPDE" w:date="2026-09-29T12:54:16Z">
     <w:p>
       <w:pPr>
         <w:pStyle w:val="CommentText"/>
@@ -1185,7 +1185,7 @@
       </w:r>
     </w:p>
   </w:comment>
-  <w:comment w:id="13" w:author="Formation IGPDE" w:initials="IGPDE" w:date="2026-09-27T20:57:33Z">
+  <w:comment w:id="13" w:author="Formation IGPDE" w:initials="IGPDE" w:date="2026-09-29T12:54:16Z">
     <w:p>
       <w:pPr>
         <w:pStyle w:val="CommentText"/>
@@ -1201,7 +1201,7 @@
       </w:r>
     </w:p>
   </w:comment>
-  <w:comment w:id="14" w:author="Formation IGPDE" w:initials="IGPDE" w:date="2026-09-27T20:57:33Z">
+  <w:comment w:id="14" w:author="Formation IGPDE" w:initials="IGPDE" w:date="2026-09-29T12:54:16Z">
     <w:p>
       <w:pPr>
         <w:pStyle w:val="CommentText"/>
@@ -1217,7 +1217,7 @@
       </w:r>
     </w:p>
   </w:comment>
-  <w:comment w:id="15" w:author="Formation IGPDE" w:initials="IGPDE" w:date="2026-09-27T20:57:33Z">
+  <w:comment w:id="15" w:author="Formation IGPDE" w:initials="IGPDE" w:date="2026-09-29T12:54:16Z">
     <w:p>
       <w:pPr>
         <w:pStyle w:val="CommentText"/>
@@ -1233,7 +1233,7 @@
       </w:r>
     </w:p>
   </w:comment>
-  <w:comment w:id="16" w:author="Formation IGPDE" w:initials="IGPDE" w:date="2026-09-27T20:57:33Z">
+  <w:comment w:id="16" w:author="Formation IGPDE" w:initials="IGPDE" w:date="2026-09-29T12:54:16Z">
     <w:p>
       <w:pPr>
         <w:pStyle w:val="CommentText"/>
@@ -1249,7 +1249,7 @@
       </w:r>
     </w:p>
   </w:comment>
-  <w:comment w:id="17" w:author="Formation IGPDE" w:initials="IGPDE" w:date="2026-09-27T20:57:33Z">
+  <w:comment w:id="17" w:author="Formation IGPDE" w:initials="IGPDE" w:date="2026-09-29T12:54:16Z">
     <w:p>
       <w:pPr>
         <w:pStyle w:val="CommentText"/>
@@ -1265,7 +1265,7 @@
       </w:r>
     </w:p>
   </w:comment>
-  <w:comment w:id="18" w:author="Formation IGPDE" w:initials="IGPDE" w:date="2026-09-27T20:57:33Z">
+  <w:comment w:id="18" w:author="Formation IGPDE" w:initials="IGPDE" w:date="2026-09-29T12:54:16Z">
     <w:p>
       <w:pPr>
         <w:pStyle w:val="CommentText"/>
@@ -1281,7 +1281,7 @@
       </w:r>
     </w:p>
   </w:comment>
-  <w:comment w:id="19" w:author="Formation IGPDE" w:initials="IGPDE" w:date="2026-09-27T20:57:33Z">
+  <w:comment w:id="19" w:author="Formation IGPDE" w:initials="IGPDE" w:date="2026-09-29T12:54:16Z">
     <w:p>
       <w:pPr>
         <w:pStyle w:val="CommentText"/>
@@ -1297,7 +1297,7 @@
       </w:r>
     </w:p>
   </w:comment>
-  <w:comment w:id="20" w:author="Formation IGPDE" w:initials="IGPDE" w:date="2026-09-27T20:57:33Z">
+  <w:comment w:id="20" w:author="Formation IGPDE" w:initials="IGPDE" w:date="2026-09-29T12:54:16Z">
     <w:p>
       <w:pPr>
         <w:pStyle w:val="CommentText"/>
@@ -1313,7 +1313,7 @@
       </w:r>
     </w:p>
   </w:comment>
-  <w:comment w:id="21" w:author="Formation IGPDE" w:initials="IGPDE" w:date="2026-09-27T20:57:33Z">
+  <w:comment w:id="21" w:author="Formation IGPDE" w:initials="IGPDE" w:date="2026-09-29T12:54:16Z">
     <w:p>
       <w:pPr>
         <w:pStyle w:val="CommentText"/>
@@ -1329,7 +1329,7 @@
       </w:r>
     </w:p>
   </w:comment>
-  <w:comment w:id="22" w:author="Formation IGPDE" w:initials="IGPDE" w:date="2026-09-27T20:57:33Z">
+  <w:comment w:id="22" w:author="Formation IGPDE" w:initials="IGPDE" w:date="2026-09-29T12:54:16Z">
     <w:p>
       <w:pPr>
         <w:pStyle w:val="CommentText"/>
@@ -1345,7 +1345,7 @@
       </w:r>
     </w:p>
   </w:comment>
-  <w:comment w:id="23" w:author="Formation IGPDE" w:initials="IGPDE" w:date="2026-09-27T20:57:33Z">
+  <w:comment w:id="23" w:author="Formation IGPDE" w:initials="IGPDE" w:date="2026-09-29T12:54:16Z">
     <w:p>
       <w:pPr>
         <w:pStyle w:val="CommentText"/>

</xml_diff>

<commit_message>
TP Sami : générer les checklists accessibles
</commit_message>
<xml_diff>
--- a/_source/tp-doc-aide-correction.docx
+++ b/_source/tp-doc-aide-correction.docx
@@ -2161,7 +2161,7 @@
 
 <file path=word/comments.xml><?xml version="1.0" encoding="utf-8"?>
 <w:comments xmlns:a="http://schemas.openxmlformats.org/drawingml/2006/main" xmlns:pic="http://schemas.openxmlformats.org/drawingml/2006/picture" xmlns:r="http://schemas.openxmlformats.org/officeDocument/2006/relationships" xmlns:w="http://schemas.openxmlformats.org/wordprocessingml/2006/main" xmlns:wp="http://schemas.openxmlformats.org/drawingml/2006/wordprocessingDrawing" xmlns:mc="http://schemas.openxmlformats.org/markup-compatibility/2006" xmlns:a14="http://schemas.microsoft.com/office/drawing/2010/main" xmlns:w14="http://schemas.microsoft.com/office/word/2010/wordml" xmlns:wpc="http://schemas.microsoft.com/office/word/2010/wordprocessingCanvas">
-  <w:comment w:id="0" w:author="Formation IGPDE" w:initials="IGPDE" w:date="2026-10-01T21:20:12Z">
+  <w:comment w:id="0" w:author="Formation IGPDE" w:initials="IGPDE" w:date="2026-10-01T22:36:26Z">
     <w:p>
       <w:pPr>
         <w:pStyle w:val="CommentText"/>
@@ -2177,7 +2177,7 @@
       </w:r>
     </w:p>
   </w:comment>
-  <w:comment w:id="1" w:author="Formation IGPDE" w:initials="IGPDE" w:date="2026-10-01T21:20:12Z">
+  <w:comment w:id="1" w:author="Formation IGPDE" w:initials="IGPDE" w:date="2026-10-01T22:36:26Z">
     <w:p>
       <w:pPr>
         <w:pStyle w:val="CommentText"/>
@@ -2193,7 +2193,7 @@
       </w:r>
     </w:p>
   </w:comment>
-  <w:comment w:id="2" w:author="Formation IGPDE" w:initials="IGPDE" w:date="2026-10-01T21:20:12Z">
+  <w:comment w:id="2" w:author="Formation IGPDE" w:initials="IGPDE" w:date="2026-10-01T22:36:26Z">
     <w:p>
       <w:pPr>
         <w:pStyle w:val="CommentText"/>
@@ -2209,7 +2209,7 @@
       </w:r>
     </w:p>
   </w:comment>
-  <w:comment w:id="3" w:author="Formation IGPDE" w:initials="IGPDE" w:date="2026-10-01T21:20:12Z">
+  <w:comment w:id="3" w:author="Formation IGPDE" w:initials="IGPDE" w:date="2026-10-01T22:36:26Z">
     <w:p>
       <w:pPr>
         <w:pStyle w:val="CommentText"/>
@@ -2225,7 +2225,7 @@
       </w:r>
     </w:p>
   </w:comment>
-  <w:comment w:id="4" w:author="Formation IGPDE" w:initials="IGPDE" w:date="2026-10-01T21:20:12Z">
+  <w:comment w:id="4" w:author="Formation IGPDE" w:initials="IGPDE" w:date="2026-10-01T22:36:26Z">
     <w:p>
       <w:pPr>
         <w:pStyle w:val="CommentText"/>
@@ -2241,7 +2241,7 @@
       </w:r>
     </w:p>
   </w:comment>
-  <w:comment w:id="5" w:author="Formation IGPDE" w:initials="IGPDE" w:date="2026-10-01T21:20:12Z">
+  <w:comment w:id="5" w:author="Formation IGPDE" w:initials="IGPDE" w:date="2026-10-01T22:36:26Z">
     <w:p>
       <w:pPr>
         <w:pStyle w:val="CommentText"/>
@@ -2257,7 +2257,7 @@
       </w:r>
     </w:p>
   </w:comment>
-  <w:comment w:id="6" w:author="Formation IGPDE" w:initials="IGPDE" w:date="2026-10-01T21:20:12Z">
+  <w:comment w:id="6" w:author="Formation IGPDE" w:initials="IGPDE" w:date="2026-10-01T22:36:26Z">
     <w:p>
       <w:pPr>
         <w:pStyle w:val="CommentText"/>
@@ -2273,7 +2273,7 @@
       </w:r>
     </w:p>
   </w:comment>
-  <w:comment w:id="7" w:author="Formation IGPDE" w:initials="IGPDE" w:date="2026-10-01T21:20:12Z">
+  <w:comment w:id="7" w:author="Formation IGPDE" w:initials="IGPDE" w:date="2026-10-01T22:36:26Z">
     <w:p>
       <w:pPr>
         <w:pStyle w:val="CommentText"/>
@@ -2289,7 +2289,7 @@
       </w:r>
     </w:p>
   </w:comment>
-  <w:comment w:id="8" w:author="Formation IGPDE" w:initials="IGPDE" w:date="2026-10-01T21:20:12Z">
+  <w:comment w:id="8" w:author="Formation IGPDE" w:initials="IGPDE" w:date="2026-10-01T22:36:26Z">
     <w:p>
       <w:pPr>
         <w:pStyle w:val="CommentText"/>
@@ -2305,7 +2305,7 @@
       </w:r>
     </w:p>
   </w:comment>
-  <w:comment w:id="9" w:author="Formation IGPDE" w:initials="IGPDE" w:date="2026-10-01T21:20:12Z">
+  <w:comment w:id="9" w:author="Formation IGPDE" w:initials="IGPDE" w:date="2026-10-01T22:36:26Z">
     <w:p>
       <w:pPr>
         <w:pStyle w:val="CommentText"/>
@@ -2321,7 +2321,7 @@
       </w:r>
     </w:p>
   </w:comment>
-  <w:comment w:id="10" w:author="Formation IGPDE" w:initials="IGPDE" w:date="2026-10-01T21:20:12Z">
+  <w:comment w:id="10" w:author="Formation IGPDE" w:initials="IGPDE" w:date="2026-10-01T22:36:26Z">
     <w:p>
       <w:pPr>
         <w:pStyle w:val="CommentText"/>
@@ -2337,7 +2337,7 @@
       </w:r>
     </w:p>
   </w:comment>
-  <w:comment w:id="11" w:author="Formation IGPDE" w:initials="IGPDE" w:date="2026-10-01T21:20:12Z">
+  <w:comment w:id="11" w:author="Formation IGPDE" w:initials="IGPDE" w:date="2026-10-01T22:36:26Z">
     <w:p>
       <w:pPr>
         <w:pStyle w:val="CommentText"/>
@@ -2353,7 +2353,7 @@
       </w:r>
     </w:p>
   </w:comment>
-  <w:comment w:id="12" w:author="Formation IGPDE" w:initials="IGPDE" w:date="2026-10-01T21:20:12Z">
+  <w:comment w:id="12" w:author="Formation IGPDE" w:initials="IGPDE" w:date="2026-10-01T22:36:26Z">
     <w:p>
       <w:pPr>
         <w:pStyle w:val="CommentText"/>
@@ -2369,7 +2369,7 @@
       </w:r>
     </w:p>
   </w:comment>
-  <w:comment w:id="13" w:author="Formation IGPDE" w:initials="IGPDE" w:date="2026-10-01T21:20:12Z">
+  <w:comment w:id="13" w:author="Formation IGPDE" w:initials="IGPDE" w:date="2026-10-01T22:36:26Z">
     <w:p>
       <w:pPr>
         <w:pStyle w:val="CommentText"/>
@@ -2385,7 +2385,7 @@
       </w:r>
     </w:p>
   </w:comment>
-  <w:comment w:id="14" w:author="Formation IGPDE" w:initials="IGPDE" w:date="2026-10-01T21:20:12Z">
+  <w:comment w:id="14" w:author="Formation IGPDE" w:initials="IGPDE" w:date="2026-10-01T22:36:26Z">
     <w:p>
       <w:pPr>
         <w:pStyle w:val="CommentText"/>
@@ -2401,7 +2401,7 @@
       </w:r>
     </w:p>
   </w:comment>
-  <w:comment w:id="15" w:author="Formation IGPDE" w:initials="IGPDE" w:date="2026-10-01T21:20:12Z">
+  <w:comment w:id="15" w:author="Formation IGPDE" w:initials="IGPDE" w:date="2026-10-01T22:36:26Z">
     <w:p>
       <w:pPr>
         <w:pStyle w:val="CommentText"/>
@@ -2417,7 +2417,7 @@
       </w:r>
     </w:p>
   </w:comment>
-  <w:comment w:id="16" w:author="Formation IGPDE" w:initials="IGPDE" w:date="2026-10-01T21:20:12Z">
+  <w:comment w:id="16" w:author="Formation IGPDE" w:initials="IGPDE" w:date="2026-10-01T22:36:26Z">
     <w:p>
       <w:pPr>
         <w:pStyle w:val="CommentText"/>
@@ -2433,7 +2433,7 @@
       </w:r>
     </w:p>
   </w:comment>
-  <w:comment w:id="17" w:author="Formation IGPDE" w:initials="IGPDE" w:date="2026-10-01T21:20:12Z">
+  <w:comment w:id="17" w:author="Formation IGPDE" w:initials="IGPDE" w:date="2026-10-01T22:36:26Z">
     <w:p>
       <w:pPr>
         <w:pStyle w:val="CommentText"/>
@@ -2449,7 +2449,7 @@
       </w:r>
     </w:p>
   </w:comment>
-  <w:comment w:id="18" w:author="Formation IGPDE" w:initials="IGPDE" w:date="2026-10-01T21:20:12Z">
+  <w:comment w:id="18" w:author="Formation IGPDE" w:initials="IGPDE" w:date="2026-10-01T22:36:26Z">
     <w:p>
       <w:pPr>
         <w:pStyle w:val="CommentText"/>
@@ -2605,25 +2605,6 @@
         <w:sz w:val="18"/>
       </w:rPr>
       <w:t>Guide pratique - Rendre un document Word accessible</w:t>
-    </w:r>
-    <w:r>
-      <w:rPr>
-        <w:noProof/>
-      </w:rPr>
-      <w:pict>
-        <v:shapetype id="_x0000_t136" coordsize="21600,21600" o:spt="136" path="m@7,l@8,m@5,21600l@6,21600e">
-          <v:formulas>
-            <v:f eqn="sum #0 0 10800"/>
-          </v:formulas>
-          <v:path textpathok="t"/>
-          <v:textpath on="t" fitshape="t"/>
-          <o:lock v:ext="edit" text="t" shapetype="t"/>
-        </v:shapetype>
-        <v:shape id="WaterMark" o:spid="_x0000_s2049" type="#_x0000_t136" style="position:absolute;margin-left:0;margin-top:0;width:500pt;height:100pt;rotation:315;z-index:-251658752;mso-position-horizontal:center;mso-position-horizontal-relative:margin;mso-position-vertical:center;mso-position-vertical-relative:margin" o:allowincell="f" fillcolor="silver" stroked="f">
-          <v:fill opacity=".5"/>
-          <v:textpath style="font-family:&quot;Arial&quot;;font-size:1pt" string="CONFIDENTIEL"/>
-        </v:shape>
-      </w:pict>
     </w:r>
   </w:p>
 </w:hdr>

</xml_diff>

<commit_message>
Livrables : régénérer le paquet
</commit_message>
<xml_diff>
--- a/_source/tp-doc-aide-correction.docx
+++ b/_source/tp-doc-aide-correction.docx
@@ -2161,7 +2161,7 @@
 
 <file path=word/comments.xml><?xml version="1.0" encoding="utf-8"?>
 <w:comments xmlns:a="http://schemas.openxmlformats.org/drawingml/2006/main" xmlns:pic="http://schemas.openxmlformats.org/drawingml/2006/picture" xmlns:r="http://schemas.openxmlformats.org/officeDocument/2006/relationships" xmlns:w="http://schemas.openxmlformats.org/wordprocessingml/2006/main" xmlns:wp="http://schemas.openxmlformats.org/drawingml/2006/wordprocessingDrawing" xmlns:mc="http://schemas.openxmlformats.org/markup-compatibility/2006" xmlns:a14="http://schemas.microsoft.com/office/drawing/2010/main" xmlns:w14="http://schemas.microsoft.com/office/word/2010/wordml" xmlns:wpc="http://schemas.microsoft.com/office/word/2010/wordprocessingCanvas">
-  <w:comment w:id="0" w:author="Formation IGPDE" w:initials="IGPDE" w:date="2026-10-01T22:36:26Z">
+  <w:comment w:id="0" w:author="Formation IGPDE" w:initials="IGPDE" w:date="2026-10-01T23:17:10Z">
     <w:p>
       <w:pPr>
         <w:pStyle w:val="CommentText"/>
@@ -2177,7 +2177,7 @@
       </w:r>
     </w:p>
   </w:comment>
-  <w:comment w:id="1" w:author="Formation IGPDE" w:initials="IGPDE" w:date="2026-10-01T22:36:26Z">
+  <w:comment w:id="1" w:author="Formation IGPDE" w:initials="IGPDE" w:date="2026-10-01T23:17:10Z">
     <w:p>
       <w:pPr>
         <w:pStyle w:val="CommentText"/>
@@ -2193,7 +2193,7 @@
       </w:r>
     </w:p>
   </w:comment>
-  <w:comment w:id="2" w:author="Formation IGPDE" w:initials="IGPDE" w:date="2026-10-01T22:36:26Z">
+  <w:comment w:id="2" w:author="Formation IGPDE" w:initials="IGPDE" w:date="2026-10-01T23:17:10Z">
     <w:p>
       <w:pPr>
         <w:pStyle w:val="CommentText"/>
@@ -2209,7 +2209,7 @@
       </w:r>
     </w:p>
   </w:comment>
-  <w:comment w:id="3" w:author="Formation IGPDE" w:initials="IGPDE" w:date="2026-10-01T22:36:26Z">
+  <w:comment w:id="3" w:author="Formation IGPDE" w:initials="IGPDE" w:date="2026-10-01T23:17:10Z">
     <w:p>
       <w:pPr>
         <w:pStyle w:val="CommentText"/>
@@ -2225,7 +2225,7 @@
       </w:r>
     </w:p>
   </w:comment>
-  <w:comment w:id="4" w:author="Formation IGPDE" w:initials="IGPDE" w:date="2026-10-01T22:36:26Z">
+  <w:comment w:id="4" w:author="Formation IGPDE" w:initials="IGPDE" w:date="2026-10-01T23:17:10Z">
     <w:p>
       <w:pPr>
         <w:pStyle w:val="CommentText"/>
@@ -2241,7 +2241,7 @@
       </w:r>
     </w:p>
   </w:comment>
-  <w:comment w:id="5" w:author="Formation IGPDE" w:initials="IGPDE" w:date="2026-10-01T22:36:26Z">
+  <w:comment w:id="5" w:author="Formation IGPDE" w:initials="IGPDE" w:date="2026-10-01T23:17:10Z">
     <w:p>
       <w:pPr>
         <w:pStyle w:val="CommentText"/>
@@ -2257,7 +2257,7 @@
       </w:r>
     </w:p>
   </w:comment>
-  <w:comment w:id="6" w:author="Formation IGPDE" w:initials="IGPDE" w:date="2026-10-01T22:36:26Z">
+  <w:comment w:id="6" w:author="Formation IGPDE" w:initials="IGPDE" w:date="2026-10-01T23:17:10Z">
     <w:p>
       <w:pPr>
         <w:pStyle w:val="CommentText"/>
@@ -2273,7 +2273,7 @@
       </w:r>
     </w:p>
   </w:comment>
-  <w:comment w:id="7" w:author="Formation IGPDE" w:initials="IGPDE" w:date="2026-10-01T22:36:26Z">
+  <w:comment w:id="7" w:author="Formation IGPDE" w:initials="IGPDE" w:date="2026-10-01T23:17:10Z">
     <w:p>
       <w:pPr>
         <w:pStyle w:val="CommentText"/>
@@ -2289,7 +2289,7 @@
       </w:r>
     </w:p>
   </w:comment>
-  <w:comment w:id="8" w:author="Formation IGPDE" w:initials="IGPDE" w:date="2026-10-01T22:36:26Z">
+  <w:comment w:id="8" w:author="Formation IGPDE" w:initials="IGPDE" w:date="2026-10-01T23:17:10Z">
     <w:p>
       <w:pPr>
         <w:pStyle w:val="CommentText"/>
@@ -2305,7 +2305,7 @@
       </w:r>
     </w:p>
   </w:comment>
-  <w:comment w:id="9" w:author="Formation IGPDE" w:initials="IGPDE" w:date="2026-10-01T22:36:26Z">
+  <w:comment w:id="9" w:author="Formation IGPDE" w:initials="IGPDE" w:date="2026-10-01T23:17:10Z">
     <w:p>
       <w:pPr>
         <w:pStyle w:val="CommentText"/>
@@ -2321,7 +2321,7 @@
       </w:r>
     </w:p>
   </w:comment>
-  <w:comment w:id="10" w:author="Formation IGPDE" w:initials="IGPDE" w:date="2026-10-01T22:36:26Z">
+  <w:comment w:id="10" w:author="Formation IGPDE" w:initials="IGPDE" w:date="2026-10-01T23:17:10Z">
     <w:p>
       <w:pPr>
         <w:pStyle w:val="CommentText"/>
@@ -2337,7 +2337,7 @@
       </w:r>
     </w:p>
   </w:comment>
-  <w:comment w:id="11" w:author="Formation IGPDE" w:initials="IGPDE" w:date="2026-10-01T22:36:26Z">
+  <w:comment w:id="11" w:author="Formation IGPDE" w:initials="IGPDE" w:date="2026-10-01T23:17:10Z">
     <w:p>
       <w:pPr>
         <w:pStyle w:val="CommentText"/>
@@ -2353,7 +2353,7 @@
       </w:r>
     </w:p>
   </w:comment>
-  <w:comment w:id="12" w:author="Formation IGPDE" w:initials="IGPDE" w:date="2026-10-01T22:36:26Z">
+  <w:comment w:id="12" w:author="Formation IGPDE" w:initials="IGPDE" w:date="2026-10-01T23:17:10Z">
     <w:p>
       <w:pPr>
         <w:pStyle w:val="CommentText"/>
@@ -2369,7 +2369,7 @@
       </w:r>
     </w:p>
   </w:comment>
-  <w:comment w:id="13" w:author="Formation IGPDE" w:initials="IGPDE" w:date="2026-10-01T22:36:26Z">
+  <w:comment w:id="13" w:author="Formation IGPDE" w:initials="IGPDE" w:date="2026-10-01T23:17:10Z">
     <w:p>
       <w:pPr>
         <w:pStyle w:val="CommentText"/>
@@ -2385,7 +2385,7 @@
       </w:r>
     </w:p>
   </w:comment>
-  <w:comment w:id="14" w:author="Formation IGPDE" w:initials="IGPDE" w:date="2026-10-01T22:36:26Z">
+  <w:comment w:id="14" w:author="Formation IGPDE" w:initials="IGPDE" w:date="2026-10-01T23:17:10Z">
     <w:p>
       <w:pPr>
         <w:pStyle w:val="CommentText"/>
@@ -2401,7 +2401,7 @@
       </w:r>
     </w:p>
   </w:comment>
-  <w:comment w:id="15" w:author="Formation IGPDE" w:initials="IGPDE" w:date="2026-10-01T22:36:26Z">
+  <w:comment w:id="15" w:author="Formation IGPDE" w:initials="IGPDE" w:date="2026-10-01T23:17:10Z">
     <w:p>
       <w:pPr>
         <w:pStyle w:val="CommentText"/>
@@ -2417,7 +2417,7 @@
       </w:r>
     </w:p>
   </w:comment>
-  <w:comment w:id="16" w:author="Formation IGPDE" w:initials="IGPDE" w:date="2026-10-01T22:36:26Z">
+  <w:comment w:id="16" w:author="Formation IGPDE" w:initials="IGPDE" w:date="2026-10-01T23:17:10Z">
     <w:p>
       <w:pPr>
         <w:pStyle w:val="CommentText"/>
@@ -2433,7 +2433,7 @@
       </w:r>
     </w:p>
   </w:comment>
-  <w:comment w:id="17" w:author="Formation IGPDE" w:initials="IGPDE" w:date="2026-10-01T22:36:26Z">
+  <w:comment w:id="17" w:author="Formation IGPDE" w:initials="IGPDE" w:date="2026-10-01T23:17:10Z">
     <w:p>
       <w:pPr>
         <w:pStyle w:val="CommentText"/>
@@ -2449,7 +2449,7 @@
       </w:r>
     </w:p>
   </w:comment>
-  <w:comment w:id="18" w:author="Formation IGPDE" w:initials="IGPDE" w:date="2026-10-01T22:36:26Z">
+  <w:comment w:id="18" w:author="Formation IGPDE" w:initials="IGPDE" w:date="2026-10-01T23:17:10Z">
     <w:p>
       <w:pPr>
         <w:pStyle w:val="CommentText"/>

</xml_diff>

<commit_message>
Formation : refondre le TP Word
</commit_message>
<xml_diff>
--- a/_source/tp-doc-aide-correction.docx
+++ b/_source/tp-doc-aide-correction.docx
@@ -2161,7 +2161,7 @@
 
 <file path=word/comments.xml><?xml version="1.0" encoding="utf-8"?>
 <w:comments xmlns:a="http://schemas.openxmlformats.org/drawingml/2006/main" xmlns:pic="http://schemas.openxmlformats.org/drawingml/2006/picture" xmlns:r="http://schemas.openxmlformats.org/officeDocument/2006/relationships" xmlns:w="http://schemas.openxmlformats.org/wordprocessingml/2006/main" xmlns:wp="http://schemas.openxmlformats.org/drawingml/2006/wordprocessingDrawing" xmlns:mc="http://schemas.openxmlformats.org/markup-compatibility/2006" xmlns:a14="http://schemas.microsoft.com/office/drawing/2010/main" xmlns:w14="http://schemas.microsoft.com/office/word/2010/wordml" xmlns:wpc="http://schemas.microsoft.com/office/word/2010/wordprocessingCanvas">
-  <w:comment w:id="0" w:author="Formation IGPDE" w:initials="IGPDE" w:date="2026-10-01T23:17:10Z">
+  <w:comment w:id="0" w:author="Formation IGPDE" w:initials="IGPDE" w:date="2026-10-02T07:48:38Z">
     <w:p>
       <w:pPr>
         <w:pStyle w:val="CommentText"/>
@@ -2177,7 +2177,7 @@
       </w:r>
     </w:p>
   </w:comment>
-  <w:comment w:id="1" w:author="Formation IGPDE" w:initials="IGPDE" w:date="2026-10-01T23:17:10Z">
+  <w:comment w:id="1" w:author="Formation IGPDE" w:initials="IGPDE" w:date="2026-10-02T07:48:38Z">
     <w:p>
       <w:pPr>
         <w:pStyle w:val="CommentText"/>
@@ -2193,7 +2193,7 @@
       </w:r>
     </w:p>
   </w:comment>
-  <w:comment w:id="2" w:author="Formation IGPDE" w:initials="IGPDE" w:date="2026-10-01T23:17:10Z">
+  <w:comment w:id="2" w:author="Formation IGPDE" w:initials="IGPDE" w:date="2026-10-02T07:48:38Z">
     <w:p>
       <w:pPr>
         <w:pStyle w:val="CommentText"/>
@@ -2209,7 +2209,7 @@
       </w:r>
     </w:p>
   </w:comment>
-  <w:comment w:id="3" w:author="Formation IGPDE" w:initials="IGPDE" w:date="2026-10-01T23:17:10Z">
+  <w:comment w:id="3" w:author="Formation IGPDE" w:initials="IGPDE" w:date="2026-10-02T07:48:38Z">
     <w:p>
       <w:pPr>
         <w:pStyle w:val="CommentText"/>
@@ -2225,7 +2225,7 @@
       </w:r>
     </w:p>
   </w:comment>
-  <w:comment w:id="4" w:author="Formation IGPDE" w:initials="IGPDE" w:date="2026-10-01T23:17:10Z">
+  <w:comment w:id="4" w:author="Formation IGPDE" w:initials="IGPDE" w:date="2026-10-02T07:48:38Z">
     <w:p>
       <w:pPr>
         <w:pStyle w:val="CommentText"/>
@@ -2241,7 +2241,7 @@
       </w:r>
     </w:p>
   </w:comment>
-  <w:comment w:id="5" w:author="Formation IGPDE" w:initials="IGPDE" w:date="2026-10-01T23:17:10Z">
+  <w:comment w:id="5" w:author="Formation IGPDE" w:initials="IGPDE" w:date="2026-10-02T07:48:38Z">
     <w:p>
       <w:pPr>
         <w:pStyle w:val="CommentText"/>
@@ -2257,7 +2257,7 @@
       </w:r>
     </w:p>
   </w:comment>
-  <w:comment w:id="6" w:author="Formation IGPDE" w:initials="IGPDE" w:date="2026-10-01T23:17:10Z">
+  <w:comment w:id="6" w:author="Formation IGPDE" w:initials="IGPDE" w:date="2026-10-02T07:48:38Z">
     <w:p>
       <w:pPr>
         <w:pStyle w:val="CommentText"/>
@@ -2273,7 +2273,7 @@
       </w:r>
     </w:p>
   </w:comment>
-  <w:comment w:id="7" w:author="Formation IGPDE" w:initials="IGPDE" w:date="2026-10-01T23:17:10Z">
+  <w:comment w:id="7" w:author="Formation IGPDE" w:initials="IGPDE" w:date="2026-10-02T07:48:38Z">
     <w:p>
       <w:pPr>
         <w:pStyle w:val="CommentText"/>
@@ -2289,7 +2289,7 @@
       </w:r>
     </w:p>
   </w:comment>
-  <w:comment w:id="8" w:author="Formation IGPDE" w:initials="IGPDE" w:date="2026-10-01T23:17:10Z">
+  <w:comment w:id="8" w:author="Formation IGPDE" w:initials="IGPDE" w:date="2026-10-02T07:48:38Z">
     <w:p>
       <w:pPr>
         <w:pStyle w:val="CommentText"/>
@@ -2305,7 +2305,7 @@
       </w:r>
     </w:p>
   </w:comment>
-  <w:comment w:id="9" w:author="Formation IGPDE" w:initials="IGPDE" w:date="2026-10-01T23:17:10Z">
+  <w:comment w:id="9" w:author="Formation IGPDE" w:initials="IGPDE" w:date="2026-10-02T07:48:38Z">
     <w:p>
       <w:pPr>
         <w:pStyle w:val="CommentText"/>
@@ -2321,7 +2321,7 @@
       </w:r>
     </w:p>
   </w:comment>
-  <w:comment w:id="10" w:author="Formation IGPDE" w:initials="IGPDE" w:date="2026-10-01T23:17:10Z">
+  <w:comment w:id="10" w:author="Formation IGPDE" w:initials="IGPDE" w:date="2026-10-02T07:48:38Z">
     <w:p>
       <w:pPr>
         <w:pStyle w:val="CommentText"/>
@@ -2337,7 +2337,7 @@
       </w:r>
     </w:p>
   </w:comment>
-  <w:comment w:id="11" w:author="Formation IGPDE" w:initials="IGPDE" w:date="2026-10-01T23:17:10Z">
+  <w:comment w:id="11" w:author="Formation IGPDE" w:initials="IGPDE" w:date="2026-10-02T07:48:38Z">
     <w:p>
       <w:pPr>
         <w:pStyle w:val="CommentText"/>
@@ -2353,7 +2353,7 @@
       </w:r>
     </w:p>
   </w:comment>
-  <w:comment w:id="12" w:author="Formation IGPDE" w:initials="IGPDE" w:date="2026-10-01T23:17:10Z">
+  <w:comment w:id="12" w:author="Formation IGPDE" w:initials="IGPDE" w:date="2026-10-02T07:48:38Z">
     <w:p>
       <w:pPr>
         <w:pStyle w:val="CommentText"/>
@@ -2369,7 +2369,7 @@
       </w:r>
     </w:p>
   </w:comment>
-  <w:comment w:id="13" w:author="Formation IGPDE" w:initials="IGPDE" w:date="2026-10-01T23:17:10Z">
+  <w:comment w:id="13" w:author="Formation IGPDE" w:initials="IGPDE" w:date="2026-10-02T07:48:38Z">
     <w:p>
       <w:pPr>
         <w:pStyle w:val="CommentText"/>
@@ -2385,7 +2385,7 @@
       </w:r>
     </w:p>
   </w:comment>
-  <w:comment w:id="14" w:author="Formation IGPDE" w:initials="IGPDE" w:date="2026-10-01T23:17:10Z">
+  <w:comment w:id="14" w:author="Formation IGPDE" w:initials="IGPDE" w:date="2026-10-02T07:48:38Z">
     <w:p>
       <w:pPr>
         <w:pStyle w:val="CommentText"/>
@@ -2401,7 +2401,7 @@
       </w:r>
     </w:p>
   </w:comment>
-  <w:comment w:id="15" w:author="Formation IGPDE" w:initials="IGPDE" w:date="2026-10-01T23:17:10Z">
+  <w:comment w:id="15" w:author="Formation IGPDE" w:initials="IGPDE" w:date="2026-10-02T07:48:38Z">
     <w:p>
       <w:pPr>
         <w:pStyle w:val="CommentText"/>
@@ -2417,7 +2417,7 @@
       </w:r>
     </w:p>
   </w:comment>
-  <w:comment w:id="16" w:author="Formation IGPDE" w:initials="IGPDE" w:date="2026-10-01T23:17:10Z">
+  <w:comment w:id="16" w:author="Formation IGPDE" w:initials="IGPDE" w:date="2026-10-02T07:48:38Z">
     <w:p>
       <w:pPr>
         <w:pStyle w:val="CommentText"/>
@@ -2433,7 +2433,7 @@
       </w:r>
     </w:p>
   </w:comment>
-  <w:comment w:id="17" w:author="Formation IGPDE" w:initials="IGPDE" w:date="2026-10-01T23:17:10Z">
+  <w:comment w:id="17" w:author="Formation IGPDE" w:initials="IGPDE" w:date="2026-10-02T07:48:38Z">
     <w:p>
       <w:pPr>
         <w:pStyle w:val="CommentText"/>
@@ -2449,7 +2449,7 @@
       </w:r>
     </w:p>
   </w:comment>
-  <w:comment w:id="18" w:author="Formation IGPDE" w:initials="IGPDE" w:date="2026-10-01T23:17:10Z">
+  <w:comment w:id="18" w:author="Formation IGPDE" w:initials="IGPDE" w:date="2026-10-02T07:48:38Z">
     <w:p>
       <w:pPr>
         <w:pStyle w:val="CommentText"/>

</xml_diff>

<commit_message>
Qualité : aligner le pack IGPDE et ses contrôles
Changelog: non applicable — corrections internes de cohérence et de contrôle du pack.

Backlog: non applicable — suivi actualisé dans le PRD, le ticket T16 et la todo.
</commit_message>
<xml_diff>
--- a/_source/tp-doc-aide-correction.docx
+++ b/_source/tp-doc-aide-correction.docx
@@ -2161,7 +2161,7 @@
 
 <file path=word/comments.xml><?xml version="1.0" encoding="utf-8"?>
 <w:comments xmlns:a="http://schemas.openxmlformats.org/drawingml/2006/main" xmlns:pic="http://schemas.openxmlformats.org/drawingml/2006/picture" xmlns:r="http://schemas.openxmlformats.org/officeDocument/2006/relationships" xmlns:w="http://schemas.openxmlformats.org/wordprocessingml/2006/main" xmlns:wp="http://schemas.openxmlformats.org/drawingml/2006/wordprocessingDrawing" xmlns:mc="http://schemas.openxmlformats.org/markup-compatibility/2006" xmlns:a14="http://schemas.microsoft.com/office/drawing/2010/main" xmlns:w14="http://schemas.microsoft.com/office/word/2010/wordml" xmlns:wpc="http://schemas.microsoft.com/office/word/2010/wordprocessingCanvas">
-  <w:comment w:id="0" w:author="Formation IGPDE" w:initials="IGPDE" w:date="2026-10-02T07:48:38Z">
+  <w:comment w:id="0" w:author="Formation IGPDE" w:initials="IGPDE" w:date="2026-10-02T14:53:39Z">
     <w:p>
       <w:pPr>
         <w:pStyle w:val="CommentText"/>
@@ -2177,7 +2177,7 @@
       </w:r>
     </w:p>
   </w:comment>
-  <w:comment w:id="1" w:author="Formation IGPDE" w:initials="IGPDE" w:date="2026-10-02T07:48:38Z">
+  <w:comment w:id="1" w:author="Formation IGPDE" w:initials="IGPDE" w:date="2026-10-02T14:53:39Z">
     <w:p>
       <w:pPr>
         <w:pStyle w:val="CommentText"/>
@@ -2193,7 +2193,7 @@
       </w:r>
     </w:p>
   </w:comment>
-  <w:comment w:id="2" w:author="Formation IGPDE" w:initials="IGPDE" w:date="2026-10-02T07:48:38Z">
+  <w:comment w:id="2" w:author="Formation IGPDE" w:initials="IGPDE" w:date="2026-10-02T14:53:39Z">
     <w:p>
       <w:pPr>
         <w:pStyle w:val="CommentText"/>
@@ -2209,7 +2209,7 @@
       </w:r>
     </w:p>
   </w:comment>
-  <w:comment w:id="3" w:author="Formation IGPDE" w:initials="IGPDE" w:date="2026-10-02T07:48:38Z">
+  <w:comment w:id="3" w:author="Formation IGPDE" w:initials="IGPDE" w:date="2026-10-02T14:53:39Z">
     <w:p>
       <w:pPr>
         <w:pStyle w:val="CommentText"/>
@@ -2225,7 +2225,7 @@
       </w:r>
     </w:p>
   </w:comment>
-  <w:comment w:id="4" w:author="Formation IGPDE" w:initials="IGPDE" w:date="2026-10-02T07:48:38Z">
+  <w:comment w:id="4" w:author="Formation IGPDE" w:initials="IGPDE" w:date="2026-10-02T14:53:39Z">
     <w:p>
       <w:pPr>
         <w:pStyle w:val="CommentText"/>
@@ -2241,7 +2241,7 @@
       </w:r>
     </w:p>
   </w:comment>
-  <w:comment w:id="5" w:author="Formation IGPDE" w:initials="IGPDE" w:date="2026-10-02T07:48:38Z">
+  <w:comment w:id="5" w:author="Formation IGPDE" w:initials="IGPDE" w:date="2026-10-02T14:53:39Z">
     <w:p>
       <w:pPr>
         <w:pStyle w:val="CommentText"/>
@@ -2257,7 +2257,7 @@
       </w:r>
     </w:p>
   </w:comment>
-  <w:comment w:id="6" w:author="Formation IGPDE" w:initials="IGPDE" w:date="2026-10-02T07:48:38Z">
+  <w:comment w:id="6" w:author="Formation IGPDE" w:initials="IGPDE" w:date="2026-10-02T14:53:39Z">
     <w:p>
       <w:pPr>
         <w:pStyle w:val="CommentText"/>
@@ -2273,7 +2273,7 @@
       </w:r>
     </w:p>
   </w:comment>
-  <w:comment w:id="7" w:author="Formation IGPDE" w:initials="IGPDE" w:date="2026-10-02T07:48:38Z">
+  <w:comment w:id="7" w:author="Formation IGPDE" w:initials="IGPDE" w:date="2026-10-02T14:53:39Z">
     <w:p>
       <w:pPr>
         <w:pStyle w:val="CommentText"/>
@@ -2289,7 +2289,7 @@
       </w:r>
     </w:p>
   </w:comment>
-  <w:comment w:id="8" w:author="Formation IGPDE" w:initials="IGPDE" w:date="2026-10-02T07:48:38Z">
+  <w:comment w:id="8" w:author="Formation IGPDE" w:initials="IGPDE" w:date="2026-10-02T14:53:39Z">
     <w:p>
       <w:pPr>
         <w:pStyle w:val="CommentText"/>
@@ -2305,7 +2305,7 @@
       </w:r>
     </w:p>
   </w:comment>
-  <w:comment w:id="9" w:author="Formation IGPDE" w:initials="IGPDE" w:date="2026-10-02T07:48:38Z">
+  <w:comment w:id="9" w:author="Formation IGPDE" w:initials="IGPDE" w:date="2026-10-02T14:53:39Z">
     <w:p>
       <w:pPr>
         <w:pStyle w:val="CommentText"/>
@@ -2321,7 +2321,7 @@
       </w:r>
     </w:p>
   </w:comment>
-  <w:comment w:id="10" w:author="Formation IGPDE" w:initials="IGPDE" w:date="2026-10-02T07:48:38Z">
+  <w:comment w:id="10" w:author="Formation IGPDE" w:initials="IGPDE" w:date="2026-10-02T14:53:39Z">
     <w:p>
       <w:pPr>
         <w:pStyle w:val="CommentText"/>
@@ -2337,7 +2337,7 @@
       </w:r>
     </w:p>
   </w:comment>
-  <w:comment w:id="11" w:author="Formation IGPDE" w:initials="IGPDE" w:date="2026-10-02T07:48:38Z">
+  <w:comment w:id="11" w:author="Formation IGPDE" w:initials="IGPDE" w:date="2026-10-02T14:53:39Z">
     <w:p>
       <w:pPr>
         <w:pStyle w:val="CommentText"/>
@@ -2353,7 +2353,7 @@
       </w:r>
     </w:p>
   </w:comment>
-  <w:comment w:id="12" w:author="Formation IGPDE" w:initials="IGPDE" w:date="2026-10-02T07:48:38Z">
+  <w:comment w:id="12" w:author="Formation IGPDE" w:initials="IGPDE" w:date="2026-10-02T14:53:39Z">
     <w:p>
       <w:pPr>
         <w:pStyle w:val="CommentText"/>
@@ -2369,7 +2369,7 @@
       </w:r>
     </w:p>
   </w:comment>
-  <w:comment w:id="13" w:author="Formation IGPDE" w:initials="IGPDE" w:date="2026-10-02T07:48:38Z">
+  <w:comment w:id="13" w:author="Formation IGPDE" w:initials="IGPDE" w:date="2026-10-02T14:53:39Z">
     <w:p>
       <w:pPr>
         <w:pStyle w:val="CommentText"/>
@@ -2385,7 +2385,7 @@
       </w:r>
     </w:p>
   </w:comment>
-  <w:comment w:id="14" w:author="Formation IGPDE" w:initials="IGPDE" w:date="2026-10-02T07:48:38Z">
+  <w:comment w:id="14" w:author="Formation IGPDE" w:initials="IGPDE" w:date="2026-10-02T14:53:39Z">
     <w:p>
       <w:pPr>
         <w:pStyle w:val="CommentText"/>
@@ -2401,7 +2401,7 @@
       </w:r>
     </w:p>
   </w:comment>
-  <w:comment w:id="15" w:author="Formation IGPDE" w:initials="IGPDE" w:date="2026-10-02T07:48:38Z">
+  <w:comment w:id="15" w:author="Formation IGPDE" w:initials="IGPDE" w:date="2026-10-02T14:53:39Z">
     <w:p>
       <w:pPr>
         <w:pStyle w:val="CommentText"/>
@@ -2417,7 +2417,7 @@
       </w:r>
     </w:p>
   </w:comment>
-  <w:comment w:id="16" w:author="Formation IGPDE" w:initials="IGPDE" w:date="2026-10-02T07:48:38Z">
+  <w:comment w:id="16" w:author="Formation IGPDE" w:initials="IGPDE" w:date="2026-10-02T14:53:39Z">
     <w:p>
       <w:pPr>
         <w:pStyle w:val="CommentText"/>
@@ -2433,7 +2433,7 @@
       </w:r>
     </w:p>
   </w:comment>
-  <w:comment w:id="17" w:author="Formation IGPDE" w:initials="IGPDE" w:date="2026-10-02T07:48:38Z">
+  <w:comment w:id="17" w:author="Formation IGPDE" w:initials="IGPDE" w:date="2026-10-02T14:53:39Z">
     <w:p>
       <w:pPr>
         <w:pStyle w:val="CommentText"/>
@@ -2449,7 +2449,7 @@
       </w:r>
     </w:p>
   </w:comment>
-  <w:comment w:id="18" w:author="Formation IGPDE" w:initials="IGPDE" w:date="2026-10-02T07:48:38Z">
+  <w:comment w:id="18" w:author="Formation IGPDE" w:initials="IGPDE" w:date="2026-10-02T14:53:39Z">
     <w:p>
       <w:pPr>
         <w:pStyle w:val="CommentText"/>

</xml_diff>

<commit_message>
TP Word : commentaires de correction en français
Le document avec pistes déclare volontairement l'allemand comme
langue par défaut (défaut de la station 4). Ses 19 commentaires,
sans langue propre, en héritaient : Word les vérifiait comme de
l'allemand et les soulignait.

Chaque run de commentaire déclare désormais fr-FR. La langue par
défaut et celle des styles restent en de-DE, le défaut pédagogique
est préservé. Un test couvre les deux points.

Les trois DOCX sont régénérés dans _source/ et copiés dans le pack.
</commit_message>
<xml_diff>
--- a/_source/tp-doc-aide-correction.docx
+++ b/_source/tp-doc-aide-correction.docx
@@ -2161,7 +2161,7 @@
 
 <file path=word/comments.xml><?xml version="1.0" encoding="utf-8"?>
 <w:comments xmlns:a="http://schemas.openxmlformats.org/drawingml/2006/main" xmlns:pic="http://schemas.openxmlformats.org/drawingml/2006/picture" xmlns:r="http://schemas.openxmlformats.org/officeDocument/2006/relationships" xmlns:w="http://schemas.openxmlformats.org/wordprocessingml/2006/main" xmlns:wp="http://schemas.openxmlformats.org/drawingml/2006/wordprocessingDrawing" xmlns:mc="http://schemas.openxmlformats.org/markup-compatibility/2006" xmlns:a14="http://schemas.microsoft.com/office/drawing/2010/main" xmlns:w14="http://schemas.microsoft.com/office/word/2010/wordml" xmlns:wpc="http://schemas.microsoft.com/office/word/2010/wordprocessingCanvas">
-  <w:comment w:id="0" w:author="Formation IGPDE" w:initials="IGPDE" w:date="2026-10-02T14:53:39Z">
+  <w:comment w:id="0" w:author="Formation IGPDE" w:initials="IGPDE" w:date="2026-10-02T20:10:17Z">
     <w:p>
       <w:pPr>
         <w:pStyle w:val="CommentText"/>
@@ -2169,15 +2169,19 @@
       <w:r>
         <w:rPr>
           <w:rStyle w:val="CommentReference"/>
+          <w:lang w:val="fr-FR" w:eastAsia="fr-FR" w:bidi="fr-FR"/>
         </w:rPr>
         <w:annotationRef/>
       </w:r>
       <w:r>
+        <w:rPr>
+          <w:lang w:val="fr-FR" w:eastAsia="fr-FR" w:bidi="fr-FR"/>
+        </w:rPr>
         <w:t>P-01 - Distinguer le titre principal des titres hiérarchiques. Problème : Le titre principal et des intertitres sont seulement mis en forme visuellement. Impact : Les technologies d'assistance identifient le document et sa structure. Règle : Utiliser le style Titre pour le titre principal et les styles Titre 1, Titre 2 et suivants pour la hiérarchie. Piste : Identifier le rôle du texte avant de choisir le style correspondant. Première action : Appliquer les styles adaptés sans changer le texte. Procédure Word : Accueil &gt; Styles, puis appliquer Titre au titre principal et les niveaux de titre aux sections.</w:t>
       </w:r>
     </w:p>
   </w:comment>
-  <w:comment w:id="1" w:author="Formation IGPDE" w:initials="IGPDE" w:date="2026-10-02T14:53:39Z">
+  <w:comment w:id="1" w:author="Formation IGPDE" w:initials="IGPDE" w:date="2026-10-02T20:10:17Z">
     <w:p>
       <w:pPr>
         <w:pStyle w:val="CommentText"/>
@@ -2185,15 +2189,19 @@
       <w:r>
         <w:rPr>
           <w:rStyle w:val="CommentReference"/>
+          <w:lang w:val="fr-FR" w:eastAsia="fr-FR" w:bidi="fr-FR"/>
         </w:rPr>
         <w:annotationRef/>
       </w:r>
       <w:r>
+        <w:rPr>
+          <w:lang w:val="fr-FR" w:eastAsia="fr-FR" w:bidi="fr-FR"/>
+        </w:rPr>
         <w:t>P-02 - Construire une hiérarchie de titres cohérente. Problème : La hiérarchie saute un niveau et la numérotation visuelle contredit la structure. Impact : Une structure sans saut rend le plan compréhensible et navigable. Règle : Enchaîner les niveaux de titres sans saut et conserver une numérotation cohérente. Piste : Comparer le niveau du titre avec son parent logique. Première action : Réordonner les niveaux de styles et leur numérotation. Procédure Word : Affichage &gt; Volet de navigation, puis corriger les styles depuis Accueil &gt; Styles.</w:t>
       </w:r>
     </w:p>
   </w:comment>
-  <w:comment w:id="2" w:author="Formation IGPDE" w:initials="IGPDE" w:date="2026-10-02T14:53:39Z">
+  <w:comment w:id="2" w:author="Formation IGPDE" w:initials="IGPDE" w:date="2026-10-02T20:10:17Z">
     <w:p>
       <w:pPr>
         <w:pStyle w:val="CommentText"/>
@@ -2201,15 +2209,19 @@
       <w:r>
         <w:rPr>
           <w:rStyle w:val="CommentReference"/>
+          <w:lang w:val="fr-FR" w:eastAsia="fr-FR" w:bidi="fr-FR"/>
         </w:rPr>
         <w:annotationRef/>
       </w:r>
       <w:r>
+        <w:rPr>
+          <w:lang w:val="fr-FR" w:eastAsia="fr-FR" w:bidi="fr-FR"/>
+        </w:rPr>
         <w:t>Document — P-03 - Naviguer et générer un sommaire automatique. Problème : Le document ne propose pas de sommaire automatique actualisable. Impact : Le volet et le sommaire donnent deux accès fiables à la structure. Règle : Vérifier le plan dans le volet de navigation et insérer un sommaire fondé sur les styles de titres. Piste : Le sommaire doit être produit à partir des styles, jamais saisi à la main. Première action : Contrôler le volet, insérer le sommaire et vérifier sa mise à jour. Procédure Word : Références &gt; Table des matières &gt; Table automatique, puis clic droit &gt; Mettre à jour les champs.</w:t>
       </w:r>
     </w:p>
   </w:comment>
-  <w:comment w:id="3" w:author="Formation IGPDE" w:initials="IGPDE" w:date="2026-10-02T14:53:39Z">
+  <w:comment w:id="3" w:author="Formation IGPDE" w:initials="IGPDE" w:date="2026-10-02T20:10:17Z">
     <w:p>
       <w:pPr>
         <w:pStyle w:val="CommentText"/>
@@ -2217,15 +2229,19 @@
       <w:r>
         <w:rPr>
           <w:rStyle w:val="CommentReference"/>
+          <w:lang w:val="fr-FR" w:eastAsia="fr-FR" w:bidi="fr-FR"/>
         </w:rPr>
         <w:annotationRef/>
       </w:r>
       <w:r>
+        <w:rPr>
+          <w:lang w:val="fr-FR" w:eastAsia="fr-FR" w:bidi="fr-FR"/>
+        </w:rPr>
         <w:t>P-04 - Utiliser des listes natives. Problème : Une liste est simulée avec des caractères saisis au début des paragraphes. Impact : Les lecteurs d'écran annoncent la nature et la longueur des listes. Règle : Créer les puces et numéros avec les fonctions de liste du traitement de texte. Piste : Sélectionner les éléments puis appliquer la commande de liste appropriée. Première action : Remplacer la fausse liste par une liste native. Procédure Word : Sélectionner les paragraphes, puis Accueil &gt; Puces ou Numérotation.</w:t>
       </w:r>
     </w:p>
   </w:comment>
-  <w:comment w:id="4" w:author="Formation IGPDE" w:initials="IGPDE" w:date="2026-10-02T14:53:39Z">
+  <w:comment w:id="4" w:author="Formation IGPDE" w:initials="IGPDE" w:date="2026-10-02T20:10:17Z">
     <w:p>
       <w:pPr>
         <w:pStyle w:val="CommentText"/>
@@ -2233,15 +2249,19 @@
       <w:r>
         <w:rPr>
           <w:rStyle w:val="CommentReference"/>
+          <w:lang w:val="fr-FR" w:eastAsia="fr-FR" w:bidi="fr-FR"/>
         </w:rPr>
         <w:annotationRef/>
       </w:r>
       <w:r>
+        <w:rPr>
+          <w:lang w:val="fr-FR" w:eastAsia="fr-FR" w:bidi="fr-FR"/>
+        </w:rPr>
         <w:t>P-05 - Employer les fonctions de mise en page adaptées. Problème : Une zone cumule paragraphes vides, espaces successifs, tabulations, retours forcés et saut inadapté. Impact : Une mise en page robuste reste compréhensible quand l'affichage ou la restitution change. Règle : Utiliser espacements, retraits, sauts et colonnes plutôt que paragraphes vides, espaces, tabulations ou retours forcés. Piste : Activer les marques de mise en forme avant de corriger ce qui sert seulement à positionner. Première action : Afficher les marques puis remplacer chaque artifice par la fonction prévue. Procédure Word : Accueil &gt; Afficher tout, puis régler Paragraphe, Mise en page &gt; Sauts et Mise en page &gt; Colonnes.</w:t>
       </w:r>
     </w:p>
   </w:comment>
-  <w:comment w:id="5" w:author="Formation IGPDE" w:initials="IGPDE" w:date="2026-10-02T14:53:39Z">
+  <w:comment w:id="5" w:author="Formation IGPDE" w:initials="IGPDE" w:date="2026-10-02T20:10:17Z">
     <w:p>
       <w:pPr>
         <w:pStyle w:val="CommentText"/>
@@ -2249,15 +2269,19 @@
       <w:r>
         <w:rPr>
           <w:rStyle w:val="CommentReference"/>
+          <w:lang w:val="fr-FR" w:eastAsia="fr-FR" w:bidi="fr-FR"/>
         </w:rPr>
         <w:annotationRef/>
       </w:r>
       <w:r>
+        <w:rPr>
+          <w:lang w:val="fr-FR" w:eastAsia="fr-FR" w:bidi="fr-FR"/>
+        </w:rPr>
         <w:t>P-06 - Rédiger l'alternative d'une image informative simple. Problème : Une image informative possède une alternative absente ou inadéquate. Impact : Une personne qui ne voit pas l'image reçoit son information utile. Règle : Rédiger une alternative concise liée au contexte, sans reprendre automatiquement une description générée. Piste : Décrire l'information nécessaire ici, pas l'apparence exhaustive de l'image. Première action : Observer le rôle de l'image et rédiger soi-même son alternative. Procédure Word : Clic droit sur l'image &gt; Afficher le texte de remplacement, puis renseigner la description.</w:t>
       </w:r>
     </w:p>
   </w:comment>
-  <w:comment w:id="6" w:author="Formation IGPDE" w:initials="IGPDE" w:date="2026-10-02T14:53:39Z">
+  <w:comment w:id="6" w:author="Formation IGPDE" w:initials="IGPDE" w:date="2026-10-02T20:10:17Z">
     <w:p>
       <w:pPr>
         <w:pStyle w:val="CommentText"/>
@@ -2265,15 +2289,19 @@
       <w:r>
         <w:rPr>
           <w:rStyle w:val="CommentReference"/>
+          <w:lang w:val="fr-FR" w:eastAsia="fr-FR" w:bidi="fr-FR"/>
         </w:rPr>
         <w:annotationRef/>
       </w:r>
       <w:r>
+        <w:rPr>
+          <w:lang w:val="fr-FR" w:eastAsia="fr-FR" w:bidi="fr-FR"/>
+        </w:rPr>
         <w:t>P-07 - Décrire une image complexe. Problème : Une image complexe n'offre ni résumé utile ni description détaillée équivalente. Impact : Les données ou relations complexes restent disponibles sous forme textuelle. Règle : Associer une alternative courte à une description détaillée adjacente dans le corps. Piste : Résumer la fonction dans l'alternative et placer les données ou conclusions dans le texte voisin. Première action : Ajouter une alternative courte et une description structurée à proximité. Procédure Word : Ajouter le texte de remplacement, puis saisir la description détaillée dans un paragraphe voisin.</w:t>
       </w:r>
     </w:p>
   </w:comment>
-  <w:comment w:id="7" w:author="Formation IGPDE" w:initials="IGPDE" w:date="2026-10-02T14:53:39Z">
+  <w:comment w:id="7" w:author="Formation IGPDE" w:initials="IGPDE" w:date="2026-10-02T20:10:17Z">
     <w:p>
       <w:pPr>
         <w:pStyle w:val="CommentText"/>
@@ -2281,15 +2309,19 @@
       <w:r>
         <w:rPr>
           <w:rStyle w:val="CommentReference"/>
+          <w:lang w:val="fr-FR" w:eastAsia="fr-FR" w:bidi="fr-FR"/>
         </w:rPr>
         <w:annotationRef/>
       </w:r>
       <w:r>
+        <w:rPr>
+          <w:lang w:val="fr-FR" w:eastAsia="fr-FR" w:bidi="fr-FR"/>
+        </w:rPr>
         <w:t>P-08 - Marquer une image redondante comme décorative. Problème : Une image purement redondante est annoncée comme si elle apportait une information. Impact : Les images sans information n'alourdissent pas la restitution. Règle : Déclarer décorative uniquement une image dont l'information est déjà entièrement donnée par le texte voisin. Piste : Supprimer mentalement l'image ; si aucune information ne disparaît, elle peut être décorative. Première action : Vérifier la redondance puis appliquer le traitement décoratif adapté au logiciel. Procédure Word : Afficher le texte de remplacement puis cocher Marquer comme décoratif.</w:t>
       </w:r>
     </w:p>
   </w:comment>
-  <w:comment w:id="8" w:author="Formation IGPDE" w:initials="IGPDE" w:date="2026-10-02T14:53:39Z">
+  <w:comment w:id="8" w:author="Formation IGPDE" w:initials="IGPDE" w:date="2026-10-02T20:10:17Z">
     <w:p>
       <w:pPr>
         <w:pStyle w:val="CommentText"/>
@@ -2297,15 +2329,19 @@
       <w:r>
         <w:rPr>
           <w:rStyle w:val="CommentReference"/>
+          <w:lang w:val="fr-FR" w:eastAsia="fr-FR" w:bidi="fr-FR"/>
         </w:rPr>
         <w:annotationRef/>
       </w:r>
       <w:r>
+        <w:rPr>
+          <w:lang w:val="fr-FR" w:eastAsia="fr-FR" w:bidi="fr-FR"/>
+        </w:rPr>
         <w:t>P-09 - Remplacer une image de texte par du vrai texte. Problème : Une consigne utile est uniquement présente dans une image de texte. Impact : Le contenu peut être sélectionné, agrandi, recherché et restitué correctement. Règle : Saisir en texte réel toute information textuelle qui n'a pas besoin d'être une image. Piste : Vérifier que chaque mot peut être sélectionné et modifié. Première action : Reproduire fidèlement le texte dans le corps puis retirer l'image devenue inutile. Procédure Word : Insérer le texte dans un paragraphe structuré, appliquer les styles utiles puis supprimer l'image de texte.</w:t>
       </w:r>
     </w:p>
   </w:comment>
-  <w:comment w:id="9" w:author="Formation IGPDE" w:initials="IGPDE" w:date="2026-10-02T14:53:39Z">
+  <w:comment w:id="9" w:author="Formation IGPDE" w:initials="IGPDE" w:date="2026-10-02T20:10:17Z">
     <w:p>
       <w:pPr>
         <w:pStyle w:val="CommentText"/>
@@ -2313,15 +2349,19 @@
       <w:r>
         <w:rPr>
           <w:rStyle w:val="CommentReference"/>
+          <w:lang w:val="fr-FR" w:eastAsia="fr-FR" w:bidi="fr-FR"/>
         </w:rPr>
         <w:annotationRef/>
       </w:r>
       <w:r>
+        <w:rPr>
+          <w:lang w:val="fr-FR" w:eastAsia="fr-FR" w:bidi="fr-FR"/>
+        </w:rPr>
         <w:t>P-10 - Rendre les liens autonomes et identifiables. Problème : Un lien générique ne décrit pas sa destination et un téléchargement manque d'informations utiles. Impact : La destination reste compréhensible hors contexte et repérable visuellement. Règle : Employer un libellé explicite et ajouter format, poids et langue d'un téléchargement lorsque ces informations sont connues. Piste : Lire le lien isolément et vérifier qu'il annonce sa destination. Première action : Réécrire le libellé sans changer la destination puis compléter les informations disponibles. Procédure Word : Modifier le texte affiché du lien via clic droit &gt; Modifier le lien, puis compléter le libellé dans le corps.</w:t>
       </w:r>
     </w:p>
   </w:comment>
-  <w:comment w:id="10" w:author="Formation IGPDE" w:initials="IGPDE" w:date="2026-10-02T14:53:39Z">
+  <w:comment w:id="10" w:author="Formation IGPDE" w:initials="IGPDE" w:date="2026-10-02T20:10:17Z">
     <w:p>
       <w:pPr>
         <w:pStyle w:val="CommentText"/>
@@ -2329,15 +2369,19 @@
       <w:r>
         <w:rPr>
           <w:rStyle w:val="CommentReference"/>
+          <w:lang w:val="fr-FR" w:eastAsia="fr-FR" w:bidi="fr-FR"/>
         </w:rPr>
         <w:annotationRef/>
       </w:r>
       <w:r>
+        <w:rPr>
+          <w:lang w:val="fr-FR" w:eastAsia="fr-FR" w:bidi="fr-FR"/>
+        </w:rPr>
         <w:t>Document — P-11 - Reprendre dans le corps l'information d'un filigrane. Problème : Le statut du document apparaît seulement dans un filigrane. Impact : Une information essentielle reste disponible même si le filigrane n'est pas restitué. Règle : Ne jamais faire porter une information essentielle uniquement par un filigrane, un en-tête ou un arrière-plan. Piste : Identifier l'information qui disparaîtrait si l'arrière-plan était ignoré. Première action : Reprendre le même statut à un emplacement logique du corps. Procédure Word : Ajouter le statut dans le corps avec un style adapté ; conserver ou retirer le filigrane selon son utilité visuelle.</w:t>
       </w:r>
     </w:p>
   </w:comment>
-  <w:comment w:id="11" w:author="Formation IGPDE" w:initials="IGPDE" w:date="2026-10-02T14:53:39Z">
+  <w:comment w:id="11" w:author="Formation IGPDE" w:initials="IGPDE" w:date="2026-10-02T20:10:17Z">
     <w:p>
       <w:pPr>
         <w:pStyle w:val="CommentText"/>
@@ -2345,15 +2389,19 @@
       <w:r>
         <w:rPr>
           <w:rStyle w:val="CommentReference"/>
+          <w:lang w:val="fr-FR" w:eastAsia="fr-FR" w:bidi="fr-FR"/>
         </w:rPr>
         <w:annotationRef/>
       </w:r>
       <w:r>
+        <w:rPr>
+          <w:lang w:val="fr-FR" w:eastAsia="fr-FR" w:bidi="fr-FR"/>
+        </w:rPr>
         <w:t>P-12 - Mesurer les contrastes utiles. Problème : Une couleur volontairement insuffisante est utilisée sans mesure. Impact : Les textes et éléments graphiques restent perceptibles avec une vision réduite ou altérée. Règle : Mesurer au moins 4,5 pour 1 pour le texte normal et 3 pour 1 pour le grand texte ou les éléments graphiques pertinents. Piste : Relever les deux couleurs et vérifier le ratio avec l'outil fourni avant de corriger. Première action : Mesurer la combinaison puis choisir une couleur qui atteint le seuil applicable. Procédure Word : Relever les couleurs de police et de fond, mesurer avec l'outil de contraste, puis modifier la couleur de police.</w:t>
       </w:r>
     </w:p>
   </w:comment>
-  <w:comment w:id="12" w:author="Formation IGPDE" w:initials="IGPDE" w:date="2026-10-02T14:53:39Z">
+  <w:comment w:id="12" w:author="Formation IGPDE" w:initials="IGPDE" w:date="2026-10-02T20:10:17Z">
     <w:p>
       <w:pPr>
         <w:pStyle w:val="CommentText"/>
@@ -2361,15 +2409,19 @@
       <w:r>
         <w:rPr>
           <w:rStyle w:val="CommentReference"/>
+          <w:lang w:val="fr-FR" w:eastAsia="fr-FR" w:bidi="fr-FR"/>
         </w:rPr>
         <w:annotationRef/>
       </w:r>
       <w:r>
+        <w:rPr>
+          <w:lang w:val="fr-FR" w:eastAsia="fr-FR" w:bidi="fr-FR"/>
+        </w:rPr>
         <w:t>P-13 - Ne pas transmettre une information par la couleur seule. Problème : Un graphique distingue ses séries uniquement par la couleur. Impact : L'information reste disponible sans perception fiable des couleurs. Règle : Ajouter étiquettes, motifs ou un équivalent textuel complet à tout code couleur porteur d'information. Piste : Imaginer le graphique en niveaux de gris et repérer ce qui devient ambigu. Première action : Reconstruire dans Word le graphique à partir des valeurs affichées dans l'image, puis ajouter des étiquettes et des motifs ou conserver un équivalent textuel complet. Procédure Word : Insertion &gt; Graphique &gt; Histogramme groupé, reporter les valeurs affichées dans l'image, puis afficher les étiquettes et appliquer des motifs distincts.</w:t>
       </w:r>
     </w:p>
   </w:comment>
-  <w:comment w:id="13" w:author="Formation IGPDE" w:initials="IGPDE" w:date="2026-10-02T14:53:39Z">
+  <w:comment w:id="13" w:author="Formation IGPDE" w:initials="IGPDE" w:date="2026-10-02T20:10:17Z">
     <w:p>
       <w:pPr>
         <w:pStyle w:val="CommentText"/>
@@ -2377,15 +2429,19 @@
       <w:r>
         <w:rPr>
           <w:rStyle w:val="CommentReference"/>
+          <w:lang w:val="fr-FR" w:eastAsia="fr-FR" w:bidi="fr-FR"/>
         </w:rPr>
         <w:annotationRef/>
       </w:r>
       <w:r>
+        <w:rPr>
+          <w:lang w:val="fr-FR" w:eastAsia="fr-FR" w:bidi="fr-FR"/>
+        </w:rPr>
         <w:t>P-14 - Structurer un tableau de données simple. Problème : Un tableau de données cumule en-tête non identifié, fusion et ligne fractionnable. Impact : Les relations entre en-têtes et cellules restent compréhensibles et navigables. Règle : Utiliser un tableau de données titré, sans fusion, imbrication, fractionnement de ligne ni usage de mise en page, avec en-tête identifié et répété. Piste : Vérifier d'abord que chaque cellule appartient à une grille simple. Première action : Simplifier la structure, identifier l'en-tête et régler sa répétition ainsi que les lignes. Procédure Word : Outils de tableau &gt; Disposition pour défusionner ; Propriétés du tableau pour répéter l'en-tête et interdire le fractionnement des lignes.</w:t>
       </w:r>
     </w:p>
   </w:comment>
-  <w:comment w:id="14" w:author="Formation IGPDE" w:initials="IGPDE" w:date="2026-10-02T14:53:39Z">
+  <w:comment w:id="14" w:author="Formation IGPDE" w:initials="IGPDE" w:date="2026-10-02T20:10:17Z">
     <w:p>
       <w:pPr>
         <w:pStyle w:val="CommentText"/>
@@ -2393,15 +2449,19 @@
       <w:r>
         <w:rPr>
           <w:rStyle w:val="CommentReference"/>
+          <w:lang w:val="fr-FR" w:eastAsia="fr-FR" w:bidi="fr-FR"/>
         </w:rPr>
         <w:annotationRef/>
       </w:r>
       <w:r>
+        <w:rPr>
+          <w:lang w:val="fr-FR" w:eastAsia="fr-FR" w:bidi="fr-FR"/>
+        </w:rPr>
         <w:t>P-15 - Définir les langues du document et des passages. Problème : Le document et une expression étrangère possèdent une langue absente ou incohérente. Impact : La synthèse vocale emploie la prononciation appropriée. Règle : Définir la langue principale puis baliser chaque passage dans une autre langue. Piste : Vérifier séparément la propriété du document et la langue du texte sélectionné. Première action : Régler la langue principale puis celle du passage étranger. Procédure Word : Révision &gt; Langue &gt; Définir la langue de vérification pour le document puis pour le passage sélectionné.</w:t>
       </w:r>
     </w:p>
   </w:comment>
-  <w:comment w:id="15" w:author="Formation IGPDE" w:initials="IGPDE" w:date="2026-10-02T14:53:39Z">
+  <w:comment w:id="15" w:author="Formation IGPDE" w:initials="IGPDE" w:date="2026-10-02T20:10:17Z">
     <w:p>
       <w:pPr>
         <w:pStyle w:val="CommentText"/>
@@ -2409,15 +2469,19 @@
       <w:r>
         <w:rPr>
           <w:rStyle w:val="CommentReference"/>
+          <w:lang w:val="fr-FR" w:eastAsia="fr-FR" w:bidi="fr-FR"/>
         </w:rPr>
         <w:annotationRef/>
       </w:r>
       <w:r>
+        <w:rPr>
+          <w:lang w:val="fr-FR" w:eastAsia="fr-FR" w:bidi="fr-FR"/>
+        </w:rPr>
         <w:t>P-16 - Régler une typographie lisible par les styles. Problème : Le corps utilise une police, une taille, un interligne ou un alignement qui réduit la lisibilité. Impact : Le texte demande moins d'effort de lecture et reste homogène. Règle : Employer une police sans sérif, au moins 12 points, un interligne d'au moins 1,15 et un alignement à gauche. Piste : Corriger le style source puis vérifier plusieurs paragraphes. Première action : Modifier le style du corps plutôt que corriger les paragraphes un par un. Procédure Word : Accueil &gt; Styles &gt; Modifier le style Normal, puis régler police, taille, alignement et paragraphe.</w:t>
       </w:r>
     </w:p>
   </w:comment>
-  <w:comment w:id="16" w:author="Formation IGPDE" w:initials="IGPDE" w:date="2026-10-02T14:53:39Z">
+  <w:comment w:id="16" w:author="Formation IGPDE" w:initials="IGPDE" w:date="2026-10-02T20:10:17Z">
     <w:p>
       <w:pPr>
         <w:pStyle w:val="CommentText"/>
@@ -2425,15 +2489,19 @@
       <w:r>
         <w:rPr>
           <w:rStyle w:val="CommentReference"/>
+          <w:lang w:val="fr-FR" w:eastAsia="fr-FR" w:bidi="fr-FR"/>
         </w:rPr>
         <w:annotationRef/>
       </w:r>
       <w:r>
+        <w:rPr>
+          <w:lang w:val="fr-FR" w:eastAsia="fr-FR" w:bidi="fr-FR"/>
+        </w:rPr>
         <w:t>P-17 - Appliquer la casse par la mise en forme. Problème : Un texte est saisi directement en capitales sans accents. Impact : Les accents, la recherche et la restitution du texte restent corrects. Règle : Saisir les mots normalement avec leurs accents puis appliquer l'apparence en majuscules par le style. Piste : Revenir au mot correctement orthographié avant de régler son apparence. Première action : Rétablir la saisie normale et appliquer la casse visuelle par la mise en forme. Procédure Word : Corriger le texte, puis Police &gt; Effets &gt; Majuscules si cette apparence est nécessaire.</w:t>
       </w:r>
     </w:p>
   </w:comment>
-  <w:comment w:id="17" w:author="Formation IGPDE" w:initials="IGPDE" w:date="2026-10-02T14:53:39Z">
+  <w:comment w:id="17" w:author="Formation IGPDE" w:initials="IGPDE" w:date="2026-10-02T20:10:17Z">
     <w:p>
       <w:pPr>
         <w:pStyle w:val="CommentText"/>
@@ -2441,15 +2509,19 @@
       <w:r>
         <w:rPr>
           <w:rStyle w:val="CommentReference"/>
+          <w:lang w:val="fr-FR" w:eastAsia="fr-FR" w:bidi="fr-FR"/>
         </w:rPr>
         <w:annotationRef/>
       </w:r>
       <w:r>
+        <w:rPr>
+          <w:lang w:val="fr-FR" w:eastAsia="fr-FR" w:bidi="fr-FR"/>
+        </w:rPr>
         <w:t>P-18 - Développer les sigles et vérifier les majuscules. Problème : Un acronyme n'est jamais développé et les mots en majuscules échappent à la vérification. Impact : Les termes abrégés deviennent compréhensibles et les erreurs restent détectables. Règle : Développer chaque sigle ou acronyme à sa première occurrence et inclure les mots en majuscules dans la vérification orthographique. Piste : Chercher la première apparition avant d'ajouter le développement. Première action : Développer la première occurrence et activer l'option de vérification correspondante. Procédure Word : Développer le terme dans le corps, puis Fichier &gt; Options &gt; Vérification et décocher Ignorer les mots en MAJUSCULES.</w:t>
       </w:r>
     </w:p>
   </w:comment>
-  <w:comment w:id="18" w:author="Formation IGPDE" w:initials="IGPDE" w:date="2026-10-02T14:53:39Z">
+  <w:comment w:id="18" w:author="Formation IGPDE" w:initials="IGPDE" w:date="2026-10-02T20:10:17Z">
     <w:p>
       <w:pPr>
         <w:pStyle w:val="CommentText"/>
@@ -2457,10 +2529,14 @@
       <w:r>
         <w:rPr>
           <w:rStyle w:val="CommentReference"/>
+          <w:lang w:val="fr-FR" w:eastAsia="fr-FR" w:bidi="fr-FR"/>
         </w:rPr>
         <w:annotationRef/>
       </w:r>
       <w:r>
+        <w:rPr>
+          <w:lang w:val="fr-FR" w:eastAsia="fr-FR" w:bidi="fr-FR"/>
+        </w:rPr>
         <w:t>Document — P-19 - Renseigner les propriétés et le nom du fichier. Problème : Les propriétés sont absentes et le nom du fichier ne décrit pas son contenu. Impact : Le document est identifiable dans les outils, les listes de fichiers et les technologies d'assistance. Règle : Renseigner titre, auteur et langue puis enregistrer sous un nom descriptif. Piste : Distinguer le titre interne, la propriété Titre et le nom de fichier. Première action : Compléter les propriétés puis enregistrer une copie sous un nom descriptif. Procédure Word : Fichier &gt; Informations &gt; Propriétés &gt; Propriétés avancées, puis Fichier &gt; Enregistrer sous.</w:t>
       </w:r>
     </w:p>

</xml_diff>

<commit_message>
TP Word : pistes en 14 pt et P-04 par liste
Les commentaires de correction étaient peu lisibles dans Word : ils
passent en 14 pt avec un interligne de 1,5.

P-04 ne commentait que la fausse liste à puces. La fausse liste
numérotée reçoit sa propre piste ; chaque commentaire précise la
liste visée. La matrice passe P-04 à deux occurrences, conformément
au contrat un commentaire par occurrence.
</commit_message>
<xml_diff>
--- a/_source/tp-doc-aide-correction.docx
+++ b/_source/tp-doc-aide-correction.docx
@@ -143,16 +143,16 @@
       </w:r>
     </w:p>
     <w:p>
-      <w:commentRangeStart w:id="10"/>
+      <w:commentRangeStart w:id="11"/>
       <w:r>
         <w:t>Ce guide pratique présente les principales vérifications à effectuer pour rendre un document Word accessible. Il associe chaque règle à une manipulation et à une preuve de correction.</w:t>
       </w:r>
-      <w:commentRangeEnd w:id="10"/>
+      <w:commentRangeEnd w:id="11"/>
       <w:r>
         <w:rPr>
           <w:rStyle w:val="CommentReference"/>
         </w:rPr>
-        <w:commentReference w:id="10"/>
+        <w:commentReference w:id="11"/>
       </w:r>
     </w:p>
     <w:p>
@@ -635,6 +635,7 @@
       <w:pPr>
         <w:ind w:left="504" w:hanging="259"/>
       </w:pPr>
+      <w:commentRangeStart w:id="4"/>
       <w:r>
         <w:rPr>
           <w:rFonts w:ascii="Arial" w:hAnsi="Arial"/>
@@ -643,6 +644,13 @@
         <w:t>1.</w:t>
         <w:tab/>
         <w:t>Refonte de la page d'accueil</w:t>
+      </w:r>
+      <w:commentRangeEnd w:id="4"/>
+      <w:r>
+        <w:rPr>
+          <w:rStyle w:val="CommentReference"/>
+        </w:rPr>
+        <w:commentReference w:id="4"/>
       </w:r>
     </w:p>
     <w:p>
@@ -724,16 +732,16 @@
       <w:pPr>
         <w:pStyle w:val="Heading3"/>
       </w:pPr>
-      <w:commentRangeStart w:id="4"/>
+      <w:commentRangeStart w:id="5"/>
       <w:r>
         <w:t>Mise en page robuste</w:t>
       </w:r>
-      <w:commentRangeEnd w:id="4"/>
+      <w:commentRangeEnd w:id="5"/>
       <w:r>
         <w:rPr>
           <w:rStyle w:val="CommentReference"/>
         </w:rPr>
-        <w:commentReference w:id="4"/>
+        <w:commentReference w:id="5"/>
       </w:r>
     </w:p>
     <w:p>
@@ -845,7 +853,7 @@
       <w:pPr>
         <w:jc w:val="center"/>
       </w:pPr>
-      <w:commentRangeStart w:id="5"/>
+      <w:commentRangeStart w:id="6"/>
       <w:r>
         <w:drawing>
           <wp:inline xmlns:a="http://schemas.openxmlformats.org/drawingml/2006/main" xmlns:pic="http://schemas.openxmlformats.org/drawingml/2006/picture">
@@ -880,12 +888,12 @@
           </wp:inline>
         </w:drawing>
       </w:r>
-      <w:commentRangeEnd w:id="5"/>
+      <w:commentRangeEnd w:id="6"/>
       <w:r>
         <w:rPr>
           <w:rStyle w:val="CommentReference"/>
         </w:rPr>
-        <w:commentReference w:id="5"/>
+        <w:commentReference w:id="6"/>
       </w:r>
     </w:p>
     <w:p>
@@ -939,7 +947,7 @@
       <w:pPr>
         <w:jc w:val="center"/>
       </w:pPr>
-      <w:commentRangeStart w:id="6"/>
+      <w:commentRangeStart w:id="7"/>
       <w:r>
         <w:drawing>
           <wp:inline xmlns:a="http://schemas.openxmlformats.org/drawingml/2006/main" xmlns:pic="http://schemas.openxmlformats.org/drawingml/2006/picture">
@@ -974,12 +982,12 @@
           </wp:inline>
         </w:drawing>
       </w:r>
-      <w:commentRangeEnd w:id="6"/>
+      <w:commentRangeEnd w:id="7"/>
       <w:r>
         <w:rPr>
           <w:rStyle w:val="CommentReference"/>
         </w:rPr>
-        <w:commentReference w:id="6"/>
+        <w:commentReference w:id="7"/>
       </w:r>
     </w:p>
     <w:p>
@@ -1033,7 +1041,7 @@
       <w:r>
         <w:t xml:space="preserve">Pour toute question, contactez-nous par </w:t>
       </w:r>
-      <w:commentRangeStart w:id="7"/>
+      <w:commentRangeStart w:id="8"/>
       <w:r>
         <w:drawing>
           <wp:inline xmlns:a="http://schemas.openxmlformats.org/drawingml/2006/main" xmlns:pic="http://schemas.openxmlformats.org/drawingml/2006/picture">
@@ -1068,12 +1076,12 @@
           </wp:inline>
         </w:drawing>
       </w:r>
-      <w:commentRangeEnd w:id="7"/>
+      <w:commentRangeEnd w:id="8"/>
       <w:r>
         <w:rPr>
           <w:rStyle w:val="CommentReference"/>
         </w:rPr>
-        <w:commentReference w:id="7"/>
+        <w:commentReference w:id="8"/>
       </w:r>
       <w:r>
         <w:t xml:space="preserve"> e-mail pour plus d'informations.</w:t>
@@ -1130,7 +1138,7 @@
       <w:pPr>
         <w:jc w:val="center"/>
       </w:pPr>
-      <w:commentRangeStart w:id="8"/>
+      <w:commentRangeStart w:id="9"/>
       <w:r>
         <w:drawing>
           <wp:inline xmlns:a="http://schemas.openxmlformats.org/drawingml/2006/main" xmlns:pic="http://schemas.openxmlformats.org/drawingml/2006/picture">
@@ -1165,12 +1173,12 @@
           </wp:inline>
         </w:drawing>
       </w:r>
-      <w:commentRangeEnd w:id="8"/>
+      <w:commentRangeEnd w:id="9"/>
       <w:r>
         <w:rPr>
           <w:rStyle w:val="CommentReference"/>
         </w:rPr>
-        <w:commentReference w:id="8"/>
+        <w:commentReference w:id="9"/>
       </w:r>
     </w:p>
     <w:p>
@@ -1221,7 +1229,7 @@
       </w:r>
     </w:p>
     <w:p>
-      <w:commentRangeStart w:id="9"/>
+      <w:commentRangeStart w:id="10"/>
       <w:r>
         <w:t xml:space="preserve">Pour accéder aux annexes, </w:t>
       </w:r>
@@ -1237,12 +1245,12 @@
       <w:r>
         <w:t>.</w:t>
       </w:r>
-      <w:commentRangeEnd w:id="9"/>
+      <w:commentRangeEnd w:id="10"/>
       <w:r>
         <w:rPr>
           <w:rStyle w:val="CommentReference"/>
         </w:rPr>
-        <w:commentReference w:id="9"/>
+        <w:commentReference w:id="10"/>
       </w:r>
     </w:p>
     <w:p>
@@ -1352,7 +1360,7 @@
       </w:r>
     </w:p>
     <w:p>
-      <w:commentRangeStart w:id="11"/>
+      <w:commentRangeStart w:id="12"/>
       <w:r>
         <w:rPr>
           <w:rFonts w:ascii="Arial" w:hAnsi="Arial"/>
@@ -1361,12 +1369,12 @@
         </w:rPr>
         <w:t>Information complémentaire : résultats provisoires.</w:t>
       </w:r>
-      <w:commentRangeEnd w:id="11"/>
+      <w:commentRangeEnd w:id="12"/>
       <w:r>
         <w:rPr>
           <w:rStyle w:val="CommentReference"/>
         </w:rPr>
-        <w:commentReference w:id="11"/>
+        <w:commentReference w:id="12"/>
       </w:r>
     </w:p>
     <w:p>
@@ -1428,7 +1436,7 @@
       <w:pPr>
         <w:jc w:val="center"/>
       </w:pPr>
-      <w:commentRangeStart w:id="12"/>
+      <w:commentRangeStart w:id="13"/>
       <w:r>
         <w:drawing>
           <wp:inline xmlns:a="http://schemas.openxmlformats.org/drawingml/2006/main" xmlns:pic="http://schemas.openxmlformats.org/drawingml/2006/picture">
@@ -1463,12 +1471,12 @@
           </wp:inline>
         </w:drawing>
       </w:r>
-      <w:commentRangeEnd w:id="12"/>
+      <w:commentRangeEnd w:id="13"/>
       <w:r>
         <w:rPr>
           <w:rStyle w:val="CommentReference"/>
         </w:rPr>
-        <w:commentReference w:id="12"/>
+        <w:commentReference w:id="13"/>
       </w:r>
     </w:p>
     <w:p>
@@ -1565,7 +1573,7 @@
             <w:gridSpan w:val="2"/>
           </w:tcPr>
           <w:p>
-            <w:commentRangeStart w:id="13"/>
+            <w:commentRangeStart w:id="14"/>
             <w:r>
               <w:rPr>
                 <w:rFonts w:ascii="Arial" w:hAnsi="Arial"/>
@@ -1576,12 +1584,12 @@
               <w:br/>
               <w:t>Budget</w:t>
             </w:r>
-            <w:commentRangeEnd w:id="13"/>
+            <w:commentRangeEnd w:id="14"/>
             <w:r>
               <w:rPr>
                 <w:rStyle w:val="CommentReference"/>
               </w:rPr>
-              <w:commentReference w:id="13"/>
+              <w:commentReference w:id="14"/>
             </w:r>
           </w:p>
         </w:tc>
@@ -1735,7 +1743,7 @@
       </w:r>
     </w:p>
     <w:p>
-      <w:commentRangeStart w:id="14"/>
+      <w:commentRangeStart w:id="15"/>
       <w:r>
         <w:rPr>
           <w:rFonts w:ascii="Arial" w:hAnsi="Arial"/>
@@ -1743,12 +1751,12 @@
         </w:rPr>
         <w:t>The quarterly report is available upon request. Please contact the communication department for further details.</w:t>
       </w:r>
-      <w:commentRangeEnd w:id="14"/>
+      <w:commentRangeEnd w:id="15"/>
       <w:r>
         <w:rPr>
           <w:rStyle w:val="CommentReference"/>
         </w:rPr>
-        <w:commentReference w:id="14"/>
+        <w:commentReference w:id="15"/>
       </w:r>
     </w:p>
     <w:p>
@@ -1799,16 +1807,16 @@
       </w:r>
     </w:p>
     <w:p>
-      <w:commentRangeStart w:id="15"/>
+      <w:commentRangeStart w:id="16"/>
       <w:r>
         <w:t>La mise en forme du corps du document est pilotée par le style Normal.</w:t>
       </w:r>
-      <w:commentRangeEnd w:id="15"/>
+      <w:commentRangeEnd w:id="16"/>
       <w:r>
         <w:rPr>
           <w:rStyle w:val="CommentReference"/>
         </w:rPr>
-        <w:commentReference w:id="15"/>
+        <w:commentReference w:id="16"/>
       </w:r>
     </w:p>
     <w:p>
@@ -1862,16 +1870,16 @@
       <w:pPr>
         <w:pStyle w:val="Heading3"/>
       </w:pPr>
-      <w:commentRangeStart w:id="16"/>
+      <w:commentRangeStart w:id="17"/>
       <w:r>
         <w:t>ANNEXES - ACCESSIBILITE</w:t>
       </w:r>
-      <w:commentRangeEnd w:id="16"/>
+      <w:commentRangeEnd w:id="17"/>
       <w:r>
         <w:rPr>
           <w:rStyle w:val="CommentReference"/>
         </w:rPr>
-        <w:commentReference w:id="16"/>
+        <w:commentReference w:id="17"/>
       </w:r>
     </w:p>
     <w:p>
@@ -1922,16 +1930,16 @@
       </w:r>
     </w:p>
     <w:p>
-      <w:commentRangeStart w:id="17"/>
+      <w:commentRangeStart w:id="18"/>
       <w:r>
         <w:t>Le RGAA structure le contrôle des documents numériques.</w:t>
       </w:r>
-      <w:commentRangeEnd w:id="17"/>
+      <w:commentRangeEnd w:id="18"/>
       <w:r>
         <w:rPr>
           <w:rStyle w:val="CommentReference"/>
         </w:rPr>
-        <w:commentReference w:id="17"/>
+        <w:commentReference w:id="18"/>
       </w:r>
     </w:p>
     <w:p>
@@ -1994,16 +2002,16 @@
       </w:r>
     </w:p>
     <w:p>
-      <w:commentRangeStart w:id="18"/>
+      <w:commentRangeStart w:id="19"/>
       <w:r>
         <w:t>Document — propriétés : vérifiez le titre, l’auteur, la langue et le nom de votre copie de travail.</w:t>
       </w:r>
-      <w:commentRangeEnd w:id="18"/>
+      <w:commentRangeEnd w:id="19"/>
       <w:r>
         <w:rPr>
           <w:rStyle w:val="CommentReference"/>
         </w:rPr>
-        <w:commentReference w:id="18"/>
+        <w:commentReference w:id="19"/>
       </w:r>
     </w:p>
     <w:p>
@@ -2161,380 +2169,460 @@
 
 <file path=word/comments.xml><?xml version="1.0" encoding="utf-8"?>
 <w:comments xmlns:a="http://schemas.openxmlformats.org/drawingml/2006/main" xmlns:pic="http://schemas.openxmlformats.org/drawingml/2006/picture" xmlns:r="http://schemas.openxmlformats.org/officeDocument/2006/relationships" xmlns:w="http://schemas.openxmlformats.org/wordprocessingml/2006/main" xmlns:wp="http://schemas.openxmlformats.org/drawingml/2006/wordprocessingDrawing" xmlns:mc="http://schemas.openxmlformats.org/markup-compatibility/2006" xmlns:a14="http://schemas.microsoft.com/office/drawing/2010/main" xmlns:w14="http://schemas.microsoft.com/office/word/2010/wordml" xmlns:wpc="http://schemas.microsoft.com/office/word/2010/wordprocessingCanvas">
-  <w:comment w:id="0" w:author="Formation IGPDE" w:initials="IGPDE" w:date="2026-10-02T20:10:17Z">
+  <w:comment w:id="0" w:author="Formation IGPDE" w:initials="IGPDE" w:date="2026-10-02T20:22:25Z">
     <w:p>
       <w:pPr>
         <w:pStyle w:val="CommentText"/>
+        <w:spacing w:line="360" w:lineRule="auto"/>
       </w:pPr>
       <w:r>
         <w:rPr>
           <w:rStyle w:val="CommentReference"/>
+          <w:sz w:val="28"/>
           <w:lang w:val="fr-FR" w:eastAsia="fr-FR" w:bidi="fr-FR"/>
         </w:rPr>
         <w:annotationRef/>
       </w:r>
       <w:r>
         <w:rPr>
+          <w:sz w:val="28"/>
           <w:lang w:val="fr-FR" w:eastAsia="fr-FR" w:bidi="fr-FR"/>
         </w:rPr>
         <w:t>P-01 - Distinguer le titre principal des titres hiérarchiques. Problème : Le titre principal et des intertitres sont seulement mis en forme visuellement. Impact : Les technologies d'assistance identifient le document et sa structure. Règle : Utiliser le style Titre pour le titre principal et les styles Titre 1, Titre 2 et suivants pour la hiérarchie. Piste : Identifier le rôle du texte avant de choisir le style correspondant. Première action : Appliquer les styles adaptés sans changer le texte. Procédure Word : Accueil &gt; Styles, puis appliquer Titre au titre principal et les niveaux de titre aux sections.</w:t>
       </w:r>
     </w:p>
   </w:comment>
-  <w:comment w:id="1" w:author="Formation IGPDE" w:initials="IGPDE" w:date="2026-10-02T20:10:17Z">
+  <w:comment w:id="1" w:author="Formation IGPDE" w:initials="IGPDE" w:date="2026-10-02T20:22:25Z">
     <w:p>
       <w:pPr>
         <w:pStyle w:val="CommentText"/>
+        <w:spacing w:line="360" w:lineRule="auto"/>
       </w:pPr>
       <w:r>
         <w:rPr>
           <w:rStyle w:val="CommentReference"/>
+          <w:sz w:val="28"/>
           <w:lang w:val="fr-FR" w:eastAsia="fr-FR" w:bidi="fr-FR"/>
         </w:rPr>
         <w:annotationRef/>
       </w:r>
       <w:r>
         <w:rPr>
+          <w:sz w:val="28"/>
           <w:lang w:val="fr-FR" w:eastAsia="fr-FR" w:bidi="fr-FR"/>
         </w:rPr>
         <w:t>P-02 - Construire une hiérarchie de titres cohérente. Problème : La hiérarchie saute un niveau et la numérotation visuelle contredit la structure. Impact : Une structure sans saut rend le plan compréhensible et navigable. Règle : Enchaîner les niveaux de titres sans saut et conserver une numérotation cohérente. Piste : Comparer le niveau du titre avec son parent logique. Première action : Réordonner les niveaux de styles et leur numérotation. Procédure Word : Affichage &gt; Volet de navigation, puis corriger les styles depuis Accueil &gt; Styles.</w:t>
       </w:r>
     </w:p>
   </w:comment>
-  <w:comment w:id="2" w:author="Formation IGPDE" w:initials="IGPDE" w:date="2026-10-02T20:10:17Z">
+  <w:comment w:id="2" w:author="Formation IGPDE" w:initials="IGPDE" w:date="2026-10-02T20:22:25Z">
     <w:p>
       <w:pPr>
         <w:pStyle w:val="CommentText"/>
+        <w:spacing w:line="360" w:lineRule="auto"/>
       </w:pPr>
       <w:r>
         <w:rPr>
           <w:rStyle w:val="CommentReference"/>
+          <w:sz w:val="28"/>
           <w:lang w:val="fr-FR" w:eastAsia="fr-FR" w:bidi="fr-FR"/>
         </w:rPr>
         <w:annotationRef/>
       </w:r>
       <w:r>
         <w:rPr>
+          <w:sz w:val="28"/>
           <w:lang w:val="fr-FR" w:eastAsia="fr-FR" w:bidi="fr-FR"/>
         </w:rPr>
         <w:t>Document — P-03 - Naviguer et générer un sommaire automatique. Problème : Le document ne propose pas de sommaire automatique actualisable. Impact : Le volet et le sommaire donnent deux accès fiables à la structure. Règle : Vérifier le plan dans le volet de navigation et insérer un sommaire fondé sur les styles de titres. Piste : Le sommaire doit être produit à partir des styles, jamais saisi à la main. Première action : Contrôler le volet, insérer le sommaire et vérifier sa mise à jour. Procédure Word : Références &gt; Table des matières &gt; Table automatique, puis clic droit &gt; Mettre à jour les champs.</w:t>
       </w:r>
     </w:p>
   </w:comment>
-  <w:comment w:id="3" w:author="Formation IGPDE" w:initials="IGPDE" w:date="2026-10-02T20:10:17Z">
+  <w:comment w:id="3" w:author="Formation IGPDE" w:initials="IGPDE" w:date="2026-10-02T20:22:25Z">
     <w:p>
       <w:pPr>
         <w:pStyle w:val="CommentText"/>
+        <w:spacing w:line="360" w:lineRule="auto"/>
       </w:pPr>
       <w:r>
         <w:rPr>
           <w:rStyle w:val="CommentReference"/>
+          <w:sz w:val="28"/>
           <w:lang w:val="fr-FR" w:eastAsia="fr-FR" w:bidi="fr-FR"/>
         </w:rPr>
         <w:annotationRef/>
       </w:r>
       <w:r>
         <w:rPr>
+          <w:sz w:val="28"/>
           <w:lang w:val="fr-FR" w:eastAsia="fr-FR" w:bidi="fr-FR"/>
         </w:rPr>
-        <w:t>P-04 - Utiliser des listes natives. Problème : Une liste est simulée avec des caractères saisis au début des paragraphes. Impact : Les lecteurs d'écran annoncent la nature et la longueur des listes. Règle : Créer les puces et numéros avec les fonctions de liste du traitement de texte. Piste : Sélectionner les éléments puis appliquer la commande de liste appropriée. Première action : Remplacer la fausse liste par une liste native. Procédure Word : Sélectionner les paragraphes, puis Accueil &gt; Puces ou Numérotation.</w:t>
+        <w:t>P-04 - Utiliser des listes natives (liste à puces). Problème : Une liste est simulée avec des caractères saisis au début des paragraphes. Impact : Les lecteurs d'écran annoncent la nature et la longueur des listes. Règle : Créer les puces et numéros avec les fonctions de liste du traitement de texte. Piste : Sélectionner les éléments puis appliquer la commande de liste appropriée. Première action : Remplacer la fausse liste par une liste native. Procédure Word : Sélectionner les paragraphes, puis Accueil &gt; Puces ou Numérotation.</w:t>
       </w:r>
     </w:p>
   </w:comment>
-  <w:comment w:id="4" w:author="Formation IGPDE" w:initials="IGPDE" w:date="2026-10-02T20:10:17Z">
+  <w:comment w:id="4" w:author="Formation IGPDE" w:initials="IGPDE" w:date="2026-10-02T20:22:25Z">
     <w:p>
       <w:pPr>
         <w:pStyle w:val="CommentText"/>
+        <w:spacing w:line="360" w:lineRule="auto"/>
       </w:pPr>
       <w:r>
         <w:rPr>
           <w:rStyle w:val="CommentReference"/>
+          <w:sz w:val="28"/>
           <w:lang w:val="fr-FR" w:eastAsia="fr-FR" w:bidi="fr-FR"/>
         </w:rPr>
         <w:annotationRef/>
       </w:r>
       <w:r>
         <w:rPr>
+          <w:sz w:val="28"/>
+          <w:lang w:val="fr-FR" w:eastAsia="fr-FR" w:bidi="fr-FR"/>
+        </w:rPr>
+        <w:t>P-04 - Utiliser des listes natives (liste numérotée). Problème : Une liste est simulée avec des caractères saisis au début des paragraphes. Impact : Les lecteurs d'écran annoncent la nature et la longueur des listes. Règle : Créer les puces et numéros avec les fonctions de liste du traitement de texte. Piste : Sélectionner les éléments puis appliquer la commande de liste appropriée. Première action : Remplacer la fausse liste par une liste native. Procédure Word : Sélectionner les paragraphes, puis Accueil &gt; Puces ou Numérotation.</w:t>
+      </w:r>
+    </w:p>
+  </w:comment>
+  <w:comment w:id="5" w:author="Formation IGPDE" w:initials="IGPDE" w:date="2026-10-02T20:22:25Z">
+    <w:p>
+      <w:pPr>
+        <w:pStyle w:val="CommentText"/>
+        <w:spacing w:line="360" w:lineRule="auto"/>
+      </w:pPr>
+      <w:r>
+        <w:rPr>
+          <w:rStyle w:val="CommentReference"/>
+          <w:sz w:val="28"/>
+          <w:lang w:val="fr-FR" w:eastAsia="fr-FR" w:bidi="fr-FR"/>
+        </w:rPr>
+        <w:annotationRef/>
+      </w:r>
+      <w:r>
+        <w:rPr>
+          <w:sz w:val="28"/>
           <w:lang w:val="fr-FR" w:eastAsia="fr-FR" w:bidi="fr-FR"/>
         </w:rPr>
         <w:t>P-05 - Employer les fonctions de mise en page adaptées. Problème : Une zone cumule paragraphes vides, espaces successifs, tabulations, retours forcés et saut inadapté. Impact : Une mise en page robuste reste compréhensible quand l'affichage ou la restitution change. Règle : Utiliser espacements, retraits, sauts et colonnes plutôt que paragraphes vides, espaces, tabulations ou retours forcés. Piste : Activer les marques de mise en forme avant de corriger ce qui sert seulement à positionner. Première action : Afficher les marques puis remplacer chaque artifice par la fonction prévue. Procédure Word : Accueil &gt; Afficher tout, puis régler Paragraphe, Mise en page &gt; Sauts et Mise en page &gt; Colonnes.</w:t>
       </w:r>
     </w:p>
   </w:comment>
-  <w:comment w:id="5" w:author="Formation IGPDE" w:initials="IGPDE" w:date="2026-10-02T20:10:17Z">
+  <w:comment w:id="6" w:author="Formation IGPDE" w:initials="IGPDE" w:date="2026-10-02T20:22:25Z">
     <w:p>
       <w:pPr>
         <w:pStyle w:val="CommentText"/>
+        <w:spacing w:line="360" w:lineRule="auto"/>
       </w:pPr>
       <w:r>
         <w:rPr>
           <w:rStyle w:val="CommentReference"/>
+          <w:sz w:val="28"/>
           <w:lang w:val="fr-FR" w:eastAsia="fr-FR" w:bidi="fr-FR"/>
         </w:rPr>
         <w:annotationRef/>
       </w:r>
       <w:r>
         <w:rPr>
+          <w:sz w:val="28"/>
           <w:lang w:val="fr-FR" w:eastAsia="fr-FR" w:bidi="fr-FR"/>
         </w:rPr>
         <w:t>P-06 - Rédiger l'alternative d'une image informative simple. Problème : Une image informative possède une alternative absente ou inadéquate. Impact : Une personne qui ne voit pas l'image reçoit son information utile. Règle : Rédiger une alternative concise liée au contexte, sans reprendre automatiquement une description générée. Piste : Décrire l'information nécessaire ici, pas l'apparence exhaustive de l'image. Première action : Observer le rôle de l'image et rédiger soi-même son alternative. Procédure Word : Clic droit sur l'image &gt; Afficher le texte de remplacement, puis renseigner la description.</w:t>
       </w:r>
     </w:p>
   </w:comment>
-  <w:comment w:id="6" w:author="Formation IGPDE" w:initials="IGPDE" w:date="2026-10-02T20:10:17Z">
+  <w:comment w:id="7" w:author="Formation IGPDE" w:initials="IGPDE" w:date="2026-10-02T20:22:25Z">
     <w:p>
       <w:pPr>
         <w:pStyle w:val="CommentText"/>
+        <w:spacing w:line="360" w:lineRule="auto"/>
       </w:pPr>
       <w:r>
         <w:rPr>
           <w:rStyle w:val="CommentReference"/>
+          <w:sz w:val="28"/>
           <w:lang w:val="fr-FR" w:eastAsia="fr-FR" w:bidi="fr-FR"/>
         </w:rPr>
         <w:annotationRef/>
       </w:r>
       <w:r>
         <w:rPr>
+          <w:sz w:val="28"/>
           <w:lang w:val="fr-FR" w:eastAsia="fr-FR" w:bidi="fr-FR"/>
         </w:rPr>
         <w:t>P-07 - Décrire une image complexe. Problème : Une image complexe n'offre ni résumé utile ni description détaillée équivalente. Impact : Les données ou relations complexes restent disponibles sous forme textuelle. Règle : Associer une alternative courte à une description détaillée adjacente dans le corps. Piste : Résumer la fonction dans l'alternative et placer les données ou conclusions dans le texte voisin. Première action : Ajouter une alternative courte et une description structurée à proximité. Procédure Word : Ajouter le texte de remplacement, puis saisir la description détaillée dans un paragraphe voisin.</w:t>
       </w:r>
     </w:p>
   </w:comment>
-  <w:comment w:id="7" w:author="Formation IGPDE" w:initials="IGPDE" w:date="2026-10-02T20:10:17Z">
+  <w:comment w:id="8" w:author="Formation IGPDE" w:initials="IGPDE" w:date="2026-10-02T20:22:25Z">
     <w:p>
       <w:pPr>
         <w:pStyle w:val="CommentText"/>
+        <w:spacing w:line="360" w:lineRule="auto"/>
       </w:pPr>
       <w:r>
         <w:rPr>
           <w:rStyle w:val="CommentReference"/>
+          <w:sz w:val="28"/>
           <w:lang w:val="fr-FR" w:eastAsia="fr-FR" w:bidi="fr-FR"/>
         </w:rPr>
         <w:annotationRef/>
       </w:r>
       <w:r>
         <w:rPr>
+          <w:sz w:val="28"/>
           <w:lang w:val="fr-FR" w:eastAsia="fr-FR" w:bidi="fr-FR"/>
         </w:rPr>
         <w:t>P-08 - Marquer une image redondante comme décorative. Problème : Une image purement redondante est annoncée comme si elle apportait une information. Impact : Les images sans information n'alourdissent pas la restitution. Règle : Déclarer décorative uniquement une image dont l'information est déjà entièrement donnée par le texte voisin. Piste : Supprimer mentalement l'image ; si aucune information ne disparaît, elle peut être décorative. Première action : Vérifier la redondance puis appliquer le traitement décoratif adapté au logiciel. Procédure Word : Afficher le texte de remplacement puis cocher Marquer comme décoratif.</w:t>
       </w:r>
     </w:p>
   </w:comment>
-  <w:comment w:id="8" w:author="Formation IGPDE" w:initials="IGPDE" w:date="2026-10-02T20:10:17Z">
+  <w:comment w:id="9" w:author="Formation IGPDE" w:initials="IGPDE" w:date="2026-10-02T20:22:25Z">
     <w:p>
       <w:pPr>
         <w:pStyle w:val="CommentText"/>
+        <w:spacing w:line="360" w:lineRule="auto"/>
       </w:pPr>
       <w:r>
         <w:rPr>
           <w:rStyle w:val="CommentReference"/>
+          <w:sz w:val="28"/>
           <w:lang w:val="fr-FR" w:eastAsia="fr-FR" w:bidi="fr-FR"/>
         </w:rPr>
         <w:annotationRef/>
       </w:r>
       <w:r>
         <w:rPr>
+          <w:sz w:val="28"/>
           <w:lang w:val="fr-FR" w:eastAsia="fr-FR" w:bidi="fr-FR"/>
         </w:rPr>
         <w:t>P-09 - Remplacer une image de texte par du vrai texte. Problème : Une consigne utile est uniquement présente dans une image de texte. Impact : Le contenu peut être sélectionné, agrandi, recherché et restitué correctement. Règle : Saisir en texte réel toute information textuelle qui n'a pas besoin d'être une image. Piste : Vérifier que chaque mot peut être sélectionné et modifié. Première action : Reproduire fidèlement le texte dans le corps puis retirer l'image devenue inutile. Procédure Word : Insérer le texte dans un paragraphe structuré, appliquer les styles utiles puis supprimer l'image de texte.</w:t>
       </w:r>
     </w:p>
   </w:comment>
-  <w:comment w:id="9" w:author="Formation IGPDE" w:initials="IGPDE" w:date="2026-10-02T20:10:17Z">
+  <w:comment w:id="10" w:author="Formation IGPDE" w:initials="IGPDE" w:date="2026-10-02T20:22:25Z">
     <w:p>
       <w:pPr>
         <w:pStyle w:val="CommentText"/>
+        <w:spacing w:line="360" w:lineRule="auto"/>
       </w:pPr>
       <w:r>
         <w:rPr>
           <w:rStyle w:val="CommentReference"/>
+          <w:sz w:val="28"/>
           <w:lang w:val="fr-FR" w:eastAsia="fr-FR" w:bidi="fr-FR"/>
         </w:rPr>
         <w:annotationRef/>
       </w:r>
       <w:r>
         <w:rPr>
+          <w:sz w:val="28"/>
           <w:lang w:val="fr-FR" w:eastAsia="fr-FR" w:bidi="fr-FR"/>
         </w:rPr>
         <w:t>P-10 - Rendre les liens autonomes et identifiables. Problème : Un lien générique ne décrit pas sa destination et un téléchargement manque d'informations utiles. Impact : La destination reste compréhensible hors contexte et repérable visuellement. Règle : Employer un libellé explicite et ajouter format, poids et langue d'un téléchargement lorsque ces informations sont connues. Piste : Lire le lien isolément et vérifier qu'il annonce sa destination. Première action : Réécrire le libellé sans changer la destination puis compléter les informations disponibles. Procédure Word : Modifier le texte affiché du lien via clic droit &gt; Modifier le lien, puis compléter le libellé dans le corps.</w:t>
       </w:r>
     </w:p>
   </w:comment>
-  <w:comment w:id="10" w:author="Formation IGPDE" w:initials="IGPDE" w:date="2026-10-02T20:10:17Z">
+  <w:comment w:id="11" w:author="Formation IGPDE" w:initials="IGPDE" w:date="2026-10-02T20:22:25Z">
     <w:p>
       <w:pPr>
         <w:pStyle w:val="CommentText"/>
+        <w:spacing w:line="360" w:lineRule="auto"/>
       </w:pPr>
       <w:r>
         <w:rPr>
           <w:rStyle w:val="CommentReference"/>
+          <w:sz w:val="28"/>
           <w:lang w:val="fr-FR" w:eastAsia="fr-FR" w:bidi="fr-FR"/>
         </w:rPr>
         <w:annotationRef/>
       </w:r>
       <w:r>
         <w:rPr>
+          <w:sz w:val="28"/>
           <w:lang w:val="fr-FR" w:eastAsia="fr-FR" w:bidi="fr-FR"/>
         </w:rPr>
         <w:t>Document — P-11 - Reprendre dans le corps l'information d'un filigrane. Problème : Le statut du document apparaît seulement dans un filigrane. Impact : Une information essentielle reste disponible même si le filigrane n'est pas restitué. Règle : Ne jamais faire porter une information essentielle uniquement par un filigrane, un en-tête ou un arrière-plan. Piste : Identifier l'information qui disparaîtrait si l'arrière-plan était ignoré. Première action : Reprendre le même statut à un emplacement logique du corps. Procédure Word : Ajouter le statut dans le corps avec un style adapté ; conserver ou retirer le filigrane selon son utilité visuelle.</w:t>
       </w:r>
     </w:p>
   </w:comment>
-  <w:comment w:id="11" w:author="Formation IGPDE" w:initials="IGPDE" w:date="2026-10-02T20:10:17Z">
+  <w:comment w:id="12" w:author="Formation IGPDE" w:initials="IGPDE" w:date="2026-10-02T20:22:25Z">
     <w:p>
       <w:pPr>
         <w:pStyle w:val="CommentText"/>
+        <w:spacing w:line="360" w:lineRule="auto"/>
       </w:pPr>
       <w:r>
         <w:rPr>
           <w:rStyle w:val="CommentReference"/>
+          <w:sz w:val="28"/>
           <w:lang w:val="fr-FR" w:eastAsia="fr-FR" w:bidi="fr-FR"/>
         </w:rPr>
         <w:annotationRef/>
       </w:r>
       <w:r>
         <w:rPr>
+          <w:sz w:val="28"/>
           <w:lang w:val="fr-FR" w:eastAsia="fr-FR" w:bidi="fr-FR"/>
         </w:rPr>
         <w:t>P-12 - Mesurer les contrastes utiles. Problème : Une couleur volontairement insuffisante est utilisée sans mesure. Impact : Les textes et éléments graphiques restent perceptibles avec une vision réduite ou altérée. Règle : Mesurer au moins 4,5 pour 1 pour le texte normal et 3 pour 1 pour le grand texte ou les éléments graphiques pertinents. Piste : Relever les deux couleurs et vérifier le ratio avec l'outil fourni avant de corriger. Première action : Mesurer la combinaison puis choisir une couleur qui atteint le seuil applicable. Procédure Word : Relever les couleurs de police et de fond, mesurer avec l'outil de contraste, puis modifier la couleur de police.</w:t>
       </w:r>
     </w:p>
   </w:comment>
-  <w:comment w:id="12" w:author="Formation IGPDE" w:initials="IGPDE" w:date="2026-10-02T20:10:17Z">
+  <w:comment w:id="13" w:author="Formation IGPDE" w:initials="IGPDE" w:date="2026-10-02T20:22:25Z">
     <w:p>
       <w:pPr>
         <w:pStyle w:val="CommentText"/>
+        <w:spacing w:line="360" w:lineRule="auto"/>
       </w:pPr>
       <w:r>
         <w:rPr>
           <w:rStyle w:val="CommentReference"/>
+          <w:sz w:val="28"/>
           <w:lang w:val="fr-FR" w:eastAsia="fr-FR" w:bidi="fr-FR"/>
         </w:rPr>
         <w:annotationRef/>
       </w:r>
       <w:r>
         <w:rPr>
+          <w:sz w:val="28"/>
           <w:lang w:val="fr-FR" w:eastAsia="fr-FR" w:bidi="fr-FR"/>
         </w:rPr>
         <w:t>P-13 - Ne pas transmettre une information par la couleur seule. Problème : Un graphique distingue ses séries uniquement par la couleur. Impact : L'information reste disponible sans perception fiable des couleurs. Règle : Ajouter étiquettes, motifs ou un équivalent textuel complet à tout code couleur porteur d'information. Piste : Imaginer le graphique en niveaux de gris et repérer ce qui devient ambigu. Première action : Reconstruire dans Word le graphique à partir des valeurs affichées dans l'image, puis ajouter des étiquettes et des motifs ou conserver un équivalent textuel complet. Procédure Word : Insertion &gt; Graphique &gt; Histogramme groupé, reporter les valeurs affichées dans l'image, puis afficher les étiquettes et appliquer des motifs distincts.</w:t>
       </w:r>
     </w:p>
   </w:comment>
-  <w:comment w:id="13" w:author="Formation IGPDE" w:initials="IGPDE" w:date="2026-10-02T20:10:17Z">
+  <w:comment w:id="14" w:author="Formation IGPDE" w:initials="IGPDE" w:date="2026-10-02T20:22:25Z">
     <w:p>
       <w:pPr>
         <w:pStyle w:val="CommentText"/>
+        <w:spacing w:line="360" w:lineRule="auto"/>
       </w:pPr>
       <w:r>
         <w:rPr>
           <w:rStyle w:val="CommentReference"/>
+          <w:sz w:val="28"/>
           <w:lang w:val="fr-FR" w:eastAsia="fr-FR" w:bidi="fr-FR"/>
         </w:rPr>
         <w:annotationRef/>
       </w:r>
       <w:r>
         <w:rPr>
+          <w:sz w:val="28"/>
           <w:lang w:val="fr-FR" w:eastAsia="fr-FR" w:bidi="fr-FR"/>
         </w:rPr>
         <w:t>P-14 - Structurer un tableau de données simple. Problème : Un tableau de données cumule en-tête non identifié, fusion et ligne fractionnable. Impact : Les relations entre en-têtes et cellules restent compréhensibles et navigables. Règle : Utiliser un tableau de données titré, sans fusion, imbrication, fractionnement de ligne ni usage de mise en page, avec en-tête identifié et répété. Piste : Vérifier d'abord que chaque cellule appartient à une grille simple. Première action : Simplifier la structure, identifier l'en-tête et régler sa répétition ainsi que les lignes. Procédure Word : Outils de tableau &gt; Disposition pour défusionner ; Propriétés du tableau pour répéter l'en-tête et interdire le fractionnement des lignes.</w:t>
       </w:r>
     </w:p>
   </w:comment>
-  <w:comment w:id="14" w:author="Formation IGPDE" w:initials="IGPDE" w:date="2026-10-02T20:10:17Z">
+  <w:comment w:id="15" w:author="Formation IGPDE" w:initials="IGPDE" w:date="2026-10-02T20:22:25Z">
     <w:p>
       <w:pPr>
         <w:pStyle w:val="CommentText"/>
+        <w:spacing w:line="360" w:lineRule="auto"/>
       </w:pPr>
       <w:r>
         <w:rPr>
           <w:rStyle w:val="CommentReference"/>
+          <w:sz w:val="28"/>
           <w:lang w:val="fr-FR" w:eastAsia="fr-FR" w:bidi="fr-FR"/>
         </w:rPr>
         <w:annotationRef/>
       </w:r>
       <w:r>
         <w:rPr>
+          <w:sz w:val="28"/>
           <w:lang w:val="fr-FR" w:eastAsia="fr-FR" w:bidi="fr-FR"/>
         </w:rPr>
         <w:t>P-15 - Définir les langues du document et des passages. Problème : Le document et une expression étrangère possèdent une langue absente ou incohérente. Impact : La synthèse vocale emploie la prononciation appropriée. Règle : Définir la langue principale puis baliser chaque passage dans une autre langue. Piste : Vérifier séparément la propriété du document et la langue du texte sélectionné. Première action : Régler la langue principale puis celle du passage étranger. Procédure Word : Révision &gt; Langue &gt; Définir la langue de vérification pour le document puis pour le passage sélectionné.</w:t>
       </w:r>
     </w:p>
   </w:comment>
-  <w:comment w:id="15" w:author="Formation IGPDE" w:initials="IGPDE" w:date="2026-10-02T20:10:17Z">
+  <w:comment w:id="16" w:author="Formation IGPDE" w:initials="IGPDE" w:date="2026-10-02T20:22:25Z">
     <w:p>
       <w:pPr>
         <w:pStyle w:val="CommentText"/>
+        <w:spacing w:line="360" w:lineRule="auto"/>
       </w:pPr>
       <w:r>
         <w:rPr>
           <w:rStyle w:val="CommentReference"/>
+          <w:sz w:val="28"/>
           <w:lang w:val="fr-FR" w:eastAsia="fr-FR" w:bidi="fr-FR"/>
         </w:rPr>
         <w:annotationRef/>
       </w:r>
       <w:r>
         <w:rPr>
+          <w:sz w:val="28"/>
           <w:lang w:val="fr-FR" w:eastAsia="fr-FR" w:bidi="fr-FR"/>
         </w:rPr>
         <w:t>P-16 - Régler une typographie lisible par les styles. Problème : Le corps utilise une police, une taille, un interligne ou un alignement qui réduit la lisibilité. Impact : Le texte demande moins d'effort de lecture et reste homogène. Règle : Employer une police sans sérif, au moins 12 points, un interligne d'au moins 1,15 et un alignement à gauche. Piste : Corriger le style source puis vérifier plusieurs paragraphes. Première action : Modifier le style du corps plutôt que corriger les paragraphes un par un. Procédure Word : Accueil &gt; Styles &gt; Modifier le style Normal, puis régler police, taille, alignement et paragraphe.</w:t>
       </w:r>
     </w:p>
   </w:comment>
-  <w:comment w:id="16" w:author="Formation IGPDE" w:initials="IGPDE" w:date="2026-10-02T20:10:17Z">
+  <w:comment w:id="17" w:author="Formation IGPDE" w:initials="IGPDE" w:date="2026-10-02T20:22:25Z">
     <w:p>
       <w:pPr>
         <w:pStyle w:val="CommentText"/>
+        <w:spacing w:line="360" w:lineRule="auto"/>
       </w:pPr>
       <w:r>
         <w:rPr>
           <w:rStyle w:val="CommentReference"/>
+          <w:sz w:val="28"/>
           <w:lang w:val="fr-FR" w:eastAsia="fr-FR" w:bidi="fr-FR"/>
         </w:rPr>
         <w:annotationRef/>
       </w:r>
       <w:r>
         <w:rPr>
+          <w:sz w:val="28"/>
           <w:lang w:val="fr-FR" w:eastAsia="fr-FR" w:bidi="fr-FR"/>
         </w:rPr>
         <w:t>P-17 - Appliquer la casse par la mise en forme. Problème : Un texte est saisi directement en capitales sans accents. Impact : Les accents, la recherche et la restitution du texte restent corrects. Règle : Saisir les mots normalement avec leurs accents puis appliquer l'apparence en majuscules par le style. Piste : Revenir au mot correctement orthographié avant de régler son apparence. Première action : Rétablir la saisie normale et appliquer la casse visuelle par la mise en forme. Procédure Word : Corriger le texte, puis Police &gt; Effets &gt; Majuscules si cette apparence est nécessaire.</w:t>
       </w:r>
     </w:p>
   </w:comment>
-  <w:comment w:id="17" w:author="Formation IGPDE" w:initials="IGPDE" w:date="2026-10-02T20:10:17Z">
+  <w:comment w:id="18" w:author="Formation IGPDE" w:initials="IGPDE" w:date="2026-10-02T20:22:25Z">
     <w:p>
       <w:pPr>
         <w:pStyle w:val="CommentText"/>
+        <w:spacing w:line="360" w:lineRule="auto"/>
       </w:pPr>
       <w:r>
         <w:rPr>
           <w:rStyle w:val="CommentReference"/>
+          <w:sz w:val="28"/>
           <w:lang w:val="fr-FR" w:eastAsia="fr-FR" w:bidi="fr-FR"/>
         </w:rPr>
         <w:annotationRef/>
       </w:r>
       <w:r>
         <w:rPr>
+          <w:sz w:val="28"/>
           <w:lang w:val="fr-FR" w:eastAsia="fr-FR" w:bidi="fr-FR"/>
         </w:rPr>
         <w:t>P-18 - Développer les sigles et vérifier les majuscules. Problème : Un acronyme n'est jamais développé et les mots en majuscules échappent à la vérification. Impact : Les termes abrégés deviennent compréhensibles et les erreurs restent détectables. Règle : Développer chaque sigle ou acronyme à sa première occurrence et inclure les mots en majuscules dans la vérification orthographique. Piste : Chercher la première apparition avant d'ajouter le développement. Première action : Développer la première occurrence et activer l'option de vérification correspondante. Procédure Word : Développer le terme dans le corps, puis Fichier &gt; Options &gt; Vérification et décocher Ignorer les mots en MAJUSCULES.</w:t>
       </w:r>
     </w:p>
   </w:comment>
-  <w:comment w:id="18" w:author="Formation IGPDE" w:initials="IGPDE" w:date="2026-10-02T20:10:17Z">
+  <w:comment w:id="19" w:author="Formation IGPDE" w:initials="IGPDE" w:date="2026-10-02T20:22:25Z">
     <w:p>
       <w:pPr>
         <w:pStyle w:val="CommentText"/>
+        <w:spacing w:line="360" w:lineRule="auto"/>
       </w:pPr>
       <w:r>
         <w:rPr>
           <w:rStyle w:val="CommentReference"/>
+          <w:sz w:val="28"/>
           <w:lang w:val="fr-FR" w:eastAsia="fr-FR" w:bidi="fr-FR"/>
         </w:rPr>
         <w:annotationRef/>
       </w:r>
       <w:r>
         <w:rPr>
+          <w:sz w:val="28"/>
           <w:lang w:val="fr-FR" w:eastAsia="fr-FR" w:bidi="fr-FR"/>
         </w:rPr>
         <w:t>Document — P-19 - Renseigner les propriétés et le nom du fichier. Problème : Les propriétés sont absentes et le nom du fichier ne décrit pas son contenu. Impact : Le document est identifiable dans les outils, les listes de fichiers et les technologies d'assistance. Règle : Renseigner titre, auteur et langue puis enregistrer sous un nom descriptif. Piste : Distinguer le titre interne, la propriété Titre et le nom de fichier. Première action : Compléter les propriétés puis enregistrer une copie sous un nom descriptif. Procédure Word : Fichier &gt; Informations &gt; Propriétés &gt; Propriétés avancées, puis Fichier &gt; Enregistrer sous.</w:t>

</xml_diff>

<commit_message>
Réorganisation des livrables IGPDE
</commit_message>
<xml_diff>
--- a/_source/tp-doc-aide-correction.docx
+++ b/_source/tp-doc-aide-correction.docx
@@ -3093,7 +3093,7 @@
 
 <file path=word/comments.xml><?xml version="1.0" encoding="utf-8"?>
 <w:comments xmlns:a="http://schemas.openxmlformats.org/drawingml/2006/main" xmlns:pic="http://schemas.openxmlformats.org/drawingml/2006/picture" xmlns:r="http://schemas.openxmlformats.org/officeDocument/2006/relationships" xmlns:w="http://schemas.openxmlformats.org/wordprocessingml/2006/main" xmlns:wp="http://schemas.openxmlformats.org/drawingml/2006/wordprocessingDrawing" xmlns:mc="http://schemas.openxmlformats.org/markup-compatibility/2006" xmlns:a14="http://schemas.microsoft.com/office/drawing/2010/main" xmlns:w14="http://schemas.microsoft.com/office/word/2010/wordml" xmlns:wpc="http://schemas.microsoft.com/office/word/2010/wordprocessingCanvas">
-  <w:comment w:id="0" w:author="Formation IGPDE" w:initials="IGPDE" w:date="2026-10-02T20:51:23Z">
+  <w:comment w:id="0" w:author="Formation IGPDE" w:initials="IGPDE" w:date="2026-10-04T19:28:04Z">
     <w:p>
       <w:pPr>
         <w:pStyle w:val="CommentText"/>
@@ -3214,7 +3214,7 @@
       </w:r>
     </w:p>
   </w:comment>
-  <w:comment w:id="1" w:author="Formation IGPDE" w:initials="IGPDE" w:date="2026-10-02T20:51:23Z">
+  <w:comment w:id="1" w:author="Formation IGPDE" w:initials="IGPDE" w:date="2026-10-04T19:28:04Z">
     <w:p>
       <w:pPr>
         <w:pStyle w:val="CommentText"/>
@@ -3335,7 +3335,7 @@
       </w:r>
     </w:p>
   </w:comment>
-  <w:comment w:id="2" w:author="Formation IGPDE" w:initials="IGPDE" w:date="2026-10-02T20:51:23Z">
+  <w:comment w:id="2" w:author="Formation IGPDE" w:initials="IGPDE" w:date="2026-10-04T19:28:04Z">
     <w:p>
       <w:pPr>
         <w:pStyle w:val="CommentText"/>
@@ -3456,7 +3456,7 @@
       </w:r>
     </w:p>
   </w:comment>
-  <w:comment w:id="3" w:author="Formation IGPDE" w:initials="IGPDE" w:date="2026-10-02T20:51:23Z">
+  <w:comment w:id="3" w:author="Formation IGPDE" w:initials="IGPDE" w:date="2026-10-04T19:28:04Z">
     <w:p>
       <w:pPr>
         <w:pStyle w:val="CommentText"/>
@@ -3577,7 +3577,7 @@
       </w:r>
     </w:p>
   </w:comment>
-  <w:comment w:id="4" w:author="Formation IGPDE" w:initials="IGPDE" w:date="2026-10-02T20:51:23Z">
+  <w:comment w:id="4" w:author="Formation IGPDE" w:initials="IGPDE" w:date="2026-10-04T19:28:04Z">
     <w:p>
       <w:pPr>
         <w:pStyle w:val="CommentText"/>
@@ -3698,7 +3698,7 @@
       </w:r>
     </w:p>
   </w:comment>
-  <w:comment w:id="5" w:author="Formation IGPDE" w:initials="IGPDE" w:date="2026-10-02T20:51:23Z">
+  <w:comment w:id="5" w:author="Formation IGPDE" w:initials="IGPDE" w:date="2026-10-04T19:28:04Z">
     <w:p>
       <w:pPr>
         <w:pStyle w:val="CommentText"/>
@@ -3819,7 +3819,7 @@
       </w:r>
     </w:p>
   </w:comment>
-  <w:comment w:id="6" w:author="Formation IGPDE" w:initials="IGPDE" w:date="2026-10-02T20:51:23Z">
+  <w:comment w:id="6" w:author="Formation IGPDE" w:initials="IGPDE" w:date="2026-10-04T19:28:04Z">
     <w:p>
       <w:pPr>
         <w:pStyle w:val="CommentText"/>
@@ -3940,7 +3940,7 @@
       </w:r>
     </w:p>
   </w:comment>
-  <w:comment w:id="7" w:author="Formation IGPDE" w:initials="IGPDE" w:date="2026-10-02T20:51:23Z">
+  <w:comment w:id="7" w:author="Formation IGPDE" w:initials="IGPDE" w:date="2026-10-04T19:28:04Z">
     <w:p>
       <w:pPr>
         <w:pStyle w:val="CommentText"/>
@@ -4061,7 +4061,7 @@
       </w:r>
     </w:p>
   </w:comment>
-  <w:comment w:id="8" w:author="Formation IGPDE" w:initials="IGPDE" w:date="2026-10-02T20:51:23Z">
+  <w:comment w:id="8" w:author="Formation IGPDE" w:initials="IGPDE" w:date="2026-10-04T19:28:04Z">
     <w:p>
       <w:pPr>
         <w:pStyle w:val="CommentText"/>
@@ -4182,7 +4182,7 @@
       </w:r>
     </w:p>
   </w:comment>
-  <w:comment w:id="9" w:author="Formation IGPDE" w:initials="IGPDE" w:date="2026-10-02T20:51:23Z">
+  <w:comment w:id="9" w:author="Formation IGPDE" w:initials="IGPDE" w:date="2026-10-04T19:28:04Z">
     <w:p>
       <w:pPr>
         <w:pStyle w:val="CommentText"/>
@@ -4303,7 +4303,7 @@
       </w:r>
     </w:p>
   </w:comment>
-  <w:comment w:id="10" w:author="Formation IGPDE" w:initials="IGPDE" w:date="2026-10-02T20:51:23Z">
+  <w:comment w:id="10" w:author="Formation IGPDE" w:initials="IGPDE" w:date="2026-10-04T19:28:04Z">
     <w:p>
       <w:pPr>
         <w:pStyle w:val="CommentText"/>
@@ -4424,7 +4424,7 @@
       </w:r>
     </w:p>
   </w:comment>
-  <w:comment w:id="11" w:author="Formation IGPDE" w:initials="IGPDE" w:date="2026-10-02T20:51:23Z">
+  <w:comment w:id="11" w:author="Formation IGPDE" w:initials="IGPDE" w:date="2026-10-04T19:28:04Z">
     <w:p>
       <w:pPr>
         <w:pStyle w:val="CommentText"/>
@@ -4545,7 +4545,7 @@
       </w:r>
     </w:p>
   </w:comment>
-  <w:comment w:id="12" w:author="Formation IGPDE" w:initials="IGPDE" w:date="2026-10-02T20:51:23Z">
+  <w:comment w:id="12" w:author="Formation IGPDE" w:initials="IGPDE" w:date="2026-10-04T19:28:04Z">
     <w:p>
       <w:pPr>
         <w:pStyle w:val="CommentText"/>
@@ -4666,7 +4666,7 @@
       </w:r>
     </w:p>
   </w:comment>
-  <w:comment w:id="13" w:author="Formation IGPDE" w:initials="IGPDE" w:date="2026-10-02T20:51:23Z">
+  <w:comment w:id="13" w:author="Formation IGPDE" w:initials="IGPDE" w:date="2026-10-04T19:28:04Z">
     <w:p>
       <w:pPr>
         <w:pStyle w:val="CommentText"/>
@@ -4787,7 +4787,7 @@
       </w:r>
     </w:p>
   </w:comment>
-  <w:comment w:id="14" w:author="Formation IGPDE" w:initials="IGPDE" w:date="2026-10-02T20:51:23Z">
+  <w:comment w:id="14" w:author="Formation IGPDE" w:initials="IGPDE" w:date="2026-10-04T19:28:04Z">
     <w:p>
       <w:pPr>
         <w:pStyle w:val="CommentText"/>
@@ -4908,7 +4908,7 @@
       </w:r>
     </w:p>
   </w:comment>
-  <w:comment w:id="15" w:author="Formation IGPDE" w:initials="IGPDE" w:date="2026-10-02T20:51:23Z">
+  <w:comment w:id="15" w:author="Formation IGPDE" w:initials="IGPDE" w:date="2026-10-04T19:28:04Z">
     <w:p>
       <w:pPr>
         <w:pStyle w:val="CommentText"/>
@@ -5029,7 +5029,7 @@
       </w:r>
     </w:p>
   </w:comment>
-  <w:comment w:id="16" w:author="Formation IGPDE" w:initials="IGPDE" w:date="2026-10-02T20:51:23Z">
+  <w:comment w:id="16" w:author="Formation IGPDE" w:initials="IGPDE" w:date="2026-10-04T19:28:04Z">
     <w:p>
       <w:pPr>
         <w:pStyle w:val="CommentText"/>
@@ -5150,7 +5150,7 @@
       </w:r>
     </w:p>
   </w:comment>
-  <w:comment w:id="17" w:author="Formation IGPDE" w:initials="IGPDE" w:date="2026-10-02T20:51:23Z">
+  <w:comment w:id="17" w:author="Formation IGPDE" w:initials="IGPDE" w:date="2026-10-04T19:28:04Z">
     <w:p>
       <w:pPr>
         <w:pStyle w:val="CommentText"/>
@@ -5271,7 +5271,7 @@
       </w:r>
     </w:p>
   </w:comment>
-  <w:comment w:id="18" w:author="Formation IGPDE" w:initials="IGPDE" w:date="2026-10-02T20:51:23Z">
+  <w:comment w:id="18" w:author="Formation IGPDE" w:initials="IGPDE" w:date="2026-10-04T19:28:04Z">
     <w:p>
       <w:pPr>
         <w:pStyle w:val="CommentText"/>
@@ -5392,7 +5392,7 @@
       </w:r>
     </w:p>
   </w:comment>
-  <w:comment w:id="19" w:author="Formation IGPDE" w:initials="IGPDE" w:date="2026-10-02T20:51:23Z">
+  <w:comment w:id="19" w:author="Formation IGPDE" w:initials="IGPDE" w:date="2026-10-04T19:28:04Z">
     <w:p>
       <w:pPr>
         <w:pStyle w:val="CommentText"/>

</xml_diff>

<commit_message>
feat(tp): harmonisation des étapes et mémos
</commit_message>
<xml_diff>
--- a/_source/tp-doc-aide-correction.docx
+++ b/_source/tp-doc-aide-correction.docx
@@ -3093,7 +3093,7 @@
 
 <file path=word/comments.xml><?xml version="1.0" encoding="utf-8"?>
 <w:comments xmlns:a="http://schemas.openxmlformats.org/drawingml/2006/main" xmlns:pic="http://schemas.openxmlformats.org/drawingml/2006/picture" xmlns:r="http://schemas.openxmlformats.org/officeDocument/2006/relationships" xmlns:w="http://schemas.openxmlformats.org/wordprocessingml/2006/main" xmlns:wp="http://schemas.openxmlformats.org/drawingml/2006/wordprocessingDrawing" xmlns:mc="http://schemas.openxmlformats.org/markup-compatibility/2006" xmlns:a14="http://schemas.microsoft.com/office/drawing/2010/main" xmlns:w14="http://schemas.microsoft.com/office/word/2010/wordml" xmlns:wpc="http://schemas.microsoft.com/office/word/2010/wordprocessingCanvas">
-  <w:comment w:id="0" w:author="Formation IGPDE" w:initials="IGPDE" w:date="2026-10-04T19:28:04Z">
+  <w:comment w:id="0" w:author="Formation IGPDE" w:initials="IGPDE" w:date="2026-10-08T13:09:38Z">
     <w:p>
       <w:pPr>
         <w:pStyle w:val="CommentText"/>
@@ -3214,7 +3214,7 @@
       </w:r>
     </w:p>
   </w:comment>
-  <w:comment w:id="1" w:author="Formation IGPDE" w:initials="IGPDE" w:date="2026-10-04T19:28:04Z">
+  <w:comment w:id="1" w:author="Formation IGPDE" w:initials="IGPDE" w:date="2026-10-08T13:09:38Z">
     <w:p>
       <w:pPr>
         <w:pStyle w:val="CommentText"/>
@@ -3335,7 +3335,7 @@
       </w:r>
     </w:p>
   </w:comment>
-  <w:comment w:id="2" w:author="Formation IGPDE" w:initials="IGPDE" w:date="2026-10-04T19:28:04Z">
+  <w:comment w:id="2" w:author="Formation IGPDE" w:initials="IGPDE" w:date="2026-10-08T13:09:38Z">
     <w:p>
       <w:pPr>
         <w:pStyle w:val="CommentText"/>
@@ -3456,7 +3456,7 @@
       </w:r>
     </w:p>
   </w:comment>
-  <w:comment w:id="3" w:author="Formation IGPDE" w:initials="IGPDE" w:date="2026-10-04T19:28:04Z">
+  <w:comment w:id="3" w:author="Formation IGPDE" w:initials="IGPDE" w:date="2026-10-08T13:09:38Z">
     <w:p>
       <w:pPr>
         <w:pStyle w:val="CommentText"/>
@@ -3577,7 +3577,7 @@
       </w:r>
     </w:p>
   </w:comment>
-  <w:comment w:id="4" w:author="Formation IGPDE" w:initials="IGPDE" w:date="2026-10-04T19:28:04Z">
+  <w:comment w:id="4" w:author="Formation IGPDE" w:initials="IGPDE" w:date="2026-10-08T13:09:38Z">
     <w:p>
       <w:pPr>
         <w:pStyle w:val="CommentText"/>
@@ -3698,7 +3698,7 @@
       </w:r>
     </w:p>
   </w:comment>
-  <w:comment w:id="5" w:author="Formation IGPDE" w:initials="IGPDE" w:date="2026-10-04T19:28:04Z">
+  <w:comment w:id="5" w:author="Formation IGPDE" w:initials="IGPDE" w:date="2026-10-08T13:09:38Z">
     <w:p>
       <w:pPr>
         <w:pStyle w:val="CommentText"/>
@@ -3819,7 +3819,7 @@
       </w:r>
     </w:p>
   </w:comment>
-  <w:comment w:id="6" w:author="Formation IGPDE" w:initials="IGPDE" w:date="2026-10-04T19:28:04Z">
+  <w:comment w:id="6" w:author="Formation IGPDE" w:initials="IGPDE" w:date="2026-10-08T13:09:38Z">
     <w:p>
       <w:pPr>
         <w:pStyle w:val="CommentText"/>
@@ -3940,7 +3940,7 @@
       </w:r>
     </w:p>
   </w:comment>
-  <w:comment w:id="7" w:author="Formation IGPDE" w:initials="IGPDE" w:date="2026-10-04T19:28:04Z">
+  <w:comment w:id="7" w:author="Formation IGPDE" w:initials="IGPDE" w:date="2026-10-08T13:09:38Z">
     <w:p>
       <w:pPr>
         <w:pStyle w:val="CommentText"/>
@@ -4061,7 +4061,7 @@
       </w:r>
     </w:p>
   </w:comment>
-  <w:comment w:id="8" w:author="Formation IGPDE" w:initials="IGPDE" w:date="2026-10-04T19:28:04Z">
+  <w:comment w:id="8" w:author="Formation IGPDE" w:initials="IGPDE" w:date="2026-10-08T13:09:38Z">
     <w:p>
       <w:pPr>
         <w:pStyle w:val="CommentText"/>
@@ -4182,7 +4182,7 @@
       </w:r>
     </w:p>
   </w:comment>
-  <w:comment w:id="9" w:author="Formation IGPDE" w:initials="IGPDE" w:date="2026-10-04T19:28:04Z">
+  <w:comment w:id="9" w:author="Formation IGPDE" w:initials="IGPDE" w:date="2026-10-08T13:09:38Z">
     <w:p>
       <w:pPr>
         <w:pStyle w:val="CommentText"/>
@@ -4303,7 +4303,7 @@
       </w:r>
     </w:p>
   </w:comment>
-  <w:comment w:id="10" w:author="Formation IGPDE" w:initials="IGPDE" w:date="2026-10-04T19:28:04Z">
+  <w:comment w:id="10" w:author="Formation IGPDE" w:initials="IGPDE" w:date="2026-10-08T13:09:38Z">
     <w:p>
       <w:pPr>
         <w:pStyle w:val="CommentText"/>
@@ -4424,7 +4424,7 @@
       </w:r>
     </w:p>
   </w:comment>
-  <w:comment w:id="11" w:author="Formation IGPDE" w:initials="IGPDE" w:date="2026-10-04T19:28:04Z">
+  <w:comment w:id="11" w:author="Formation IGPDE" w:initials="IGPDE" w:date="2026-10-08T13:09:38Z">
     <w:p>
       <w:pPr>
         <w:pStyle w:val="CommentText"/>
@@ -4545,7 +4545,7 @@
       </w:r>
     </w:p>
   </w:comment>
-  <w:comment w:id="12" w:author="Formation IGPDE" w:initials="IGPDE" w:date="2026-10-04T19:28:04Z">
+  <w:comment w:id="12" w:author="Formation IGPDE" w:initials="IGPDE" w:date="2026-10-08T13:09:38Z">
     <w:p>
       <w:pPr>
         <w:pStyle w:val="CommentText"/>
@@ -4666,7 +4666,7 @@
       </w:r>
     </w:p>
   </w:comment>
-  <w:comment w:id="13" w:author="Formation IGPDE" w:initials="IGPDE" w:date="2026-10-04T19:28:04Z">
+  <w:comment w:id="13" w:author="Formation IGPDE" w:initials="IGPDE" w:date="2026-10-08T13:09:38Z">
     <w:p>
       <w:pPr>
         <w:pStyle w:val="CommentText"/>
@@ -4787,7 +4787,7 @@
       </w:r>
     </w:p>
   </w:comment>
-  <w:comment w:id="14" w:author="Formation IGPDE" w:initials="IGPDE" w:date="2026-10-04T19:28:04Z">
+  <w:comment w:id="14" w:author="Formation IGPDE" w:initials="IGPDE" w:date="2026-10-08T13:09:38Z">
     <w:p>
       <w:pPr>
         <w:pStyle w:val="CommentText"/>
@@ -4908,7 +4908,7 @@
       </w:r>
     </w:p>
   </w:comment>
-  <w:comment w:id="15" w:author="Formation IGPDE" w:initials="IGPDE" w:date="2026-10-04T19:28:04Z">
+  <w:comment w:id="15" w:author="Formation IGPDE" w:initials="IGPDE" w:date="2026-10-08T13:09:38Z">
     <w:p>
       <w:pPr>
         <w:pStyle w:val="CommentText"/>
@@ -5029,7 +5029,7 @@
       </w:r>
     </w:p>
   </w:comment>
-  <w:comment w:id="16" w:author="Formation IGPDE" w:initials="IGPDE" w:date="2026-10-04T19:28:04Z">
+  <w:comment w:id="16" w:author="Formation IGPDE" w:initials="IGPDE" w:date="2026-10-08T13:09:38Z">
     <w:p>
       <w:pPr>
         <w:pStyle w:val="CommentText"/>
@@ -5150,7 +5150,7 @@
       </w:r>
     </w:p>
   </w:comment>
-  <w:comment w:id="17" w:author="Formation IGPDE" w:initials="IGPDE" w:date="2026-10-04T19:28:04Z">
+  <w:comment w:id="17" w:author="Formation IGPDE" w:initials="IGPDE" w:date="2026-10-08T13:09:38Z">
     <w:p>
       <w:pPr>
         <w:pStyle w:val="CommentText"/>
@@ -5271,7 +5271,7 @@
       </w:r>
     </w:p>
   </w:comment>
-  <w:comment w:id="18" w:author="Formation IGPDE" w:initials="IGPDE" w:date="2026-10-04T19:28:04Z">
+  <w:comment w:id="18" w:author="Formation IGPDE" w:initials="IGPDE" w:date="2026-10-08T13:09:38Z">
     <w:p>
       <w:pPr>
         <w:pStyle w:val="CommentText"/>
@@ -5392,7 +5392,7 @@
       </w:r>
     </w:p>
   </w:comment>
-  <w:comment w:id="19" w:author="Formation IGPDE" w:initials="IGPDE" w:date="2026-10-04T19:28:04Z">
+  <w:comment w:id="19" w:author="Formation IGPDE" w:initials="IGPDE" w:date="2026-10-08T13:09:38Z">
     <w:p>
       <w:pPr>
         <w:pStyle w:val="CommentText"/>

</xml_diff>